<commit_message>
Connected lombok. Minor code and front-end tweaks.
</commit_message>
<xml_diff>
--- a/src/main/webapp/WEB-INF/template/tagtemplate.docx
+++ b/src/main/webapp/WEB-INF/template/tagtemplate.docx
@@ -19693,10 +19693,8 @@
       <w:r>
         <w:t>8. Обязанности начальника ПЧ</w:t>
       </w:r>
-      <w:bookmarkStart w:id="127" w:name="_GoBack"/>
       <w:bookmarkEnd w:id="125"/>
       <w:bookmarkEnd w:id="126"/>
-      <w:bookmarkEnd w:id="127"/>
     </w:p>
     <w:p>
       <w:pPr>
@@ -19994,16 +19992,16 @@
       <w:pPr>
         <w:pStyle w:val="2a"/>
       </w:pPr>
-      <w:bookmarkStart w:id="128" w:name="_Toc209703513"/>
-      <w:bookmarkStart w:id="129" w:name="_Toc221000986"/>
+      <w:bookmarkStart w:id="127" w:name="_Toc209703513"/>
+      <w:bookmarkStart w:id="128" w:name="_Toc221000986"/>
       <w:r>
         <w:t>13.</w:t>
       </w:r>
       <w:r>
         <w:t>9. Обязанности медицинского врача</w:t>
       </w:r>
+      <w:bookmarkEnd w:id="127"/>
       <w:bookmarkEnd w:id="128"/>
-      <w:bookmarkEnd w:id="129"/>
     </w:p>
     <w:p>
       <w:pPr>
@@ -20049,16 +20047,16 @@
       <w:pPr>
         <w:pStyle w:val="2a"/>
       </w:pPr>
-      <w:bookmarkStart w:id="130" w:name="_Toc209703514"/>
-      <w:bookmarkStart w:id="131" w:name="_Toc221000987"/>
+      <w:bookmarkStart w:id="129" w:name="_Toc209703514"/>
+      <w:bookmarkStart w:id="130" w:name="_Toc221000987"/>
       <w:r>
         <w:t>13.10</w:t>
       </w:r>
       <w:r>
         <w:t>. Служба безопасности</w:t>
       </w:r>
+      <w:bookmarkEnd w:id="129"/>
       <w:bookmarkEnd w:id="130"/>
-      <w:bookmarkEnd w:id="131"/>
     </w:p>
     <w:p>
       <w:pPr>
@@ -20093,49 +20091,25 @@
     </w:p>
     <w:p>
       <w:pPr>
-        <w:pStyle w:val="2"/>
-        <w:keepLines w:val="0"/>
-        <w:spacing w:before="0" w:line="240" w:lineRule="auto"/>
-        <w:ind w:firstLine="720"/>
-        <w:jc w:val="both"/>
-        <w:rPr>
-          <w:rFonts w:ascii="Times New Roman" w:hAnsi="Times New Roman"/>
-          <w:iCs/>
-          <w:color w:val="auto"/>
-          <w:sz w:val="24"/>
-          <w:szCs w:val="24"/>
-        </w:rPr>
-      </w:pPr>
-      <w:bookmarkStart w:id="132" w:name="_Toc433207695"/>
-      <w:bookmarkStart w:id="133" w:name="_Toc209703515"/>
-      <w:bookmarkStart w:id="134" w:name="_Toc221000988"/>
-      <w:bookmarkStart w:id="135" w:name="_Toc381802546"/>
-      <w:bookmarkStart w:id="136" w:name="_Toc391383493"/>
-      <w:bookmarkStart w:id="137" w:name="_Toc414977744"/>
-      <w:bookmarkStart w:id="138" w:name="_Toc430943246"/>
+        <w:pStyle w:val="1"/>
+        <w:jc w:val="left"/>
+      </w:pPr>
+      <w:bookmarkStart w:id="131" w:name="_Toc381802546"/>
+      <w:bookmarkStart w:id="132" w:name="_Toc391383493"/>
+      <w:bookmarkStart w:id="133" w:name="_Toc414977744"/>
+      <w:bookmarkStart w:id="134" w:name="_Toc430943246"/>
+      <w:bookmarkStart w:id="135" w:name="_Toc433207695"/>
+      <w:bookmarkStart w:id="136" w:name="_Toc209703515"/>
+      <w:bookmarkStart w:id="137" w:name="_Toc221000988"/>
       <w:bookmarkEnd w:id="106"/>
       <w:bookmarkEnd w:id="107"/>
       <w:bookmarkEnd w:id="108"/>
       <w:r>
-        <w:rPr>
-          <w:rFonts w:ascii="Times New Roman" w:hAnsi="Times New Roman"/>
-          <w:iCs/>
-          <w:color w:val="auto"/>
-          <w:sz w:val="24"/>
-          <w:szCs w:val="24"/>
-        </w:rPr>
         <w:lastRenderedPageBreak/>
         <w:t xml:space="preserve">ПРИЛОЖЕНИЕ 1. Свидетельство на право ведения аварийно-спасательных работ в чрезвычайных ситуациях </w:t>
       </w:r>
       <w:sdt>
         <w:sdtPr>
-          <w:rPr>
-            <w:rFonts w:ascii="Times New Roman" w:hAnsi="Times New Roman"/>
-            <w:iCs/>
-            <w:color w:val="auto"/>
-            <w:sz w:val="24"/>
-            <w:szCs w:val="24"/>
-          </w:rPr>
           <w:tag w:val="ASF_STATUS_SHORT"/>
           <w:id w:val="1244535499"/>
           <w:placeholder>
@@ -20146,37 +20120,16 @@
         <w:sdtEndPr/>
         <w:sdtContent>
           <w:r>
-            <w:rPr>
-              <w:rFonts w:ascii="Times New Roman" w:hAnsi="Times New Roman"/>
-              <w:iCs/>
-              <w:color w:val="auto"/>
-              <w:sz w:val="24"/>
-              <w:szCs w:val="24"/>
-            </w:rPr>
             <w:t>${ASF_STATUS_SHORT}</w:t>
           </w:r>
         </w:sdtContent>
       </w:sdt>
       <w:r>
-        <w:rPr>
-          <w:rFonts w:ascii="Times New Roman" w:hAnsi="Times New Roman"/>
-          <w:iCs/>
-          <w:color w:val="auto"/>
-          <w:sz w:val="24"/>
-          <w:szCs w:val="24"/>
-        </w:rPr>
         <w:t xml:space="preserve"> </w:t>
       </w:r>
-      <w:bookmarkEnd w:id="132"/>
+      <w:bookmarkEnd w:id="135"/>
       <w:sdt>
         <w:sdtPr>
-          <w:rPr>
-            <w:rFonts w:ascii="Times New Roman" w:hAnsi="Times New Roman"/>
-            <w:iCs/>
-            <w:color w:val="auto"/>
-            <w:sz w:val="24"/>
-            <w:szCs w:val="24"/>
-          </w:rPr>
           <w:tag w:val="ASF_SHORT_NAME"/>
           <w:id w:val="-2000408632"/>
           <w:placeholder>
@@ -20187,134 +20140,51 @@
         <w:sdtEndPr/>
         <w:sdtContent>
           <w:r>
-            <w:rPr>
-              <w:rFonts w:ascii="Times New Roman" w:hAnsi="Times New Roman"/>
-              <w:iCs/>
-              <w:color w:val="auto"/>
-              <w:sz w:val="24"/>
-              <w:szCs w:val="24"/>
-            </w:rPr>
             <w:t>${ASF_SHORT_NAME}</w:t>
           </w:r>
         </w:sdtContent>
       </w:sdt>
+      <w:bookmarkEnd w:id="136"/>
+      <w:bookmarkEnd w:id="137"/>
+    </w:p>
+    <w:p>
+      <w:pPr>
+        <w:jc w:val="center"/>
+      </w:pPr>
+      <w:r>
+        <w:t>ASF</w:t>
+      </w:r>
+      <w:r>
+        <w:t>_IMAGE_</w:t>
+      </w:r>
+      <w:r>
+        <w:t>1</w:t>
+      </w:r>
+      <w:r>
+        <w:t>_</w:t>
+      </w:r>
+      <w:r>
+        <w:t>APPENDIX</w:t>
+      </w:r>
+      <w:bookmarkStart w:id="138" w:name="_Toc209703516"/>
+      <w:bookmarkStart w:id="139" w:name="_Toc221000989"/>
+    </w:p>
+    <w:p>
+      <w:pPr>
+        <w:pStyle w:val="1"/>
+        <w:jc w:val="left"/>
+      </w:pPr>
+      <w:r>
+        <w:t xml:space="preserve">ПРИЛОЖЕНИЕ 2. Паспорт </w:t>
+      </w:r>
+      <w:bookmarkEnd w:id="131"/>
+      <w:bookmarkEnd w:id="132"/>
       <w:bookmarkEnd w:id="133"/>
       <w:bookmarkEnd w:id="134"/>
-    </w:p>
-    <w:p>
-      <w:pPr>
-        <w:spacing w:after="0" w:line="240" w:lineRule="auto"/>
-        <w:jc w:val="center"/>
-        <w:rPr>
-          <w:lang w:val="en-US"/>
-        </w:rPr>
-      </w:pPr>
-      <w:r>
-        <w:rPr>
-          <w:lang w:val="en-US"/>
-        </w:rPr>
-        <w:t>ASF</w:t>
-      </w:r>
-      <w:r>
-        <w:rPr>
-          <w:lang w:val="en-US"/>
-        </w:rPr>
-        <w:t>_IMAGE_</w:t>
-      </w:r>
-      <w:r>
-        <w:rPr>
-          <w:lang w:val="en-US"/>
-        </w:rPr>
-        <w:t>1</w:t>
-      </w:r>
-      <w:r>
-        <w:rPr>
-          <w:lang w:val="en-US"/>
-        </w:rPr>
-        <w:t>_</w:t>
-      </w:r>
-      <w:r>
-        <w:rPr>
-          <w:lang w:val="en-US"/>
-        </w:rPr>
-        <w:t>APPENDIX</w:t>
-      </w:r>
-      <w:bookmarkStart w:id="139" w:name="_Toc209703516"/>
-      <w:bookmarkStart w:id="140" w:name="_Toc221000989"/>
-    </w:p>
-    <w:p>
-      <w:pPr>
-        <w:pStyle w:val="2"/>
-        <w:keepLines w:val="0"/>
-        <w:spacing w:before="0" w:line="240" w:lineRule="auto"/>
-        <w:ind w:firstLine="720"/>
-        <w:jc w:val="both"/>
-        <w:rPr>
-          <w:rFonts w:ascii="Times New Roman" w:hAnsi="Times New Roman"/>
-          <w:color w:val="auto"/>
-          <w:sz w:val="24"/>
-          <w:szCs w:val="24"/>
-          <w:lang w:val="en-US"/>
-        </w:rPr>
-      </w:pPr>
-      <w:r>
-        <w:rPr>
-          <w:rFonts w:ascii="Times New Roman" w:hAnsi="Times New Roman"/>
-          <w:iCs/>
-          <w:color w:val="auto"/>
-          <w:sz w:val="24"/>
-          <w:szCs w:val="24"/>
-        </w:rPr>
-        <w:t>ПРИЛОЖЕНИЕ</w:t>
-      </w:r>
-      <w:r>
-        <w:rPr>
-          <w:rFonts w:ascii="Times New Roman" w:hAnsi="Times New Roman"/>
-          <w:iCs/>
-          <w:color w:val="auto"/>
-          <w:sz w:val="24"/>
-          <w:szCs w:val="24"/>
-          <w:lang w:val="en-US"/>
-        </w:rPr>
-        <w:t xml:space="preserve"> 2. </w:t>
-      </w:r>
-      <w:r>
-        <w:rPr>
-          <w:rFonts w:ascii="Times New Roman" w:hAnsi="Times New Roman"/>
-          <w:iCs/>
-          <w:color w:val="auto"/>
-          <w:sz w:val="24"/>
-          <w:szCs w:val="24"/>
-        </w:rPr>
-        <w:t>Паспорт</w:t>
-      </w:r>
-      <w:r>
-        <w:rPr>
-          <w:rFonts w:ascii="Times New Roman" w:hAnsi="Times New Roman"/>
-          <w:iCs/>
-          <w:color w:val="auto"/>
-          <w:sz w:val="24"/>
-          <w:szCs w:val="24"/>
-          <w:lang w:val="en-US"/>
-        </w:rPr>
-        <w:t xml:space="preserve"> </w:t>
-      </w:r>
-      <w:bookmarkEnd w:id="135"/>
-      <w:bookmarkEnd w:id="136"/>
-      <w:bookmarkEnd w:id="137"/>
       <w:bookmarkEnd w:id="138"/>
       <w:bookmarkEnd w:id="139"/>
-      <w:bookmarkEnd w:id="140"/>
       <w:sdt>
         <w:sdtPr>
-          <w:rPr>
-            <w:rFonts w:ascii="Times New Roman" w:hAnsi="Times New Roman"/>
-            <w:iCs/>
-            <w:color w:val="auto"/>
-            <w:sz w:val="24"/>
-            <w:szCs w:val="24"/>
-            <w:lang w:val="en-US"/>
-          </w:rPr>
           <w:tag w:val="ASF_STATUS_SHORT"/>
           <w:id w:val="1402640020"/>
           <w:placeholder>
@@ -20325,39 +20195,15 @@
         <w:sdtEndPr/>
         <w:sdtContent>
           <w:r>
-            <w:rPr>
-              <w:rFonts w:ascii="Times New Roman" w:hAnsi="Times New Roman"/>
-              <w:iCs/>
-              <w:color w:val="auto"/>
-              <w:sz w:val="24"/>
-              <w:szCs w:val="24"/>
-              <w:lang w:val="en-US"/>
-            </w:rPr>
             <w:t>${ASF_STATUS_SHORT}</w:t>
           </w:r>
         </w:sdtContent>
       </w:sdt>
       <w:r>
-        <w:rPr>
-          <w:rFonts w:ascii="Times New Roman" w:hAnsi="Times New Roman"/>
-          <w:iCs/>
-          <w:color w:val="auto"/>
-          <w:sz w:val="24"/>
-          <w:szCs w:val="24"/>
-          <w:lang w:val="en-US"/>
-        </w:rPr>
         <w:t xml:space="preserve"> </w:t>
       </w:r>
       <w:sdt>
         <w:sdtPr>
-          <w:rPr>
-            <w:rFonts w:ascii="Times New Roman" w:hAnsi="Times New Roman"/>
-            <w:iCs/>
-            <w:color w:val="auto"/>
-            <w:sz w:val="24"/>
-            <w:szCs w:val="24"/>
-            <w:lang w:val="en-US"/>
-          </w:rPr>
           <w:tag w:val="ASF_SHORT_NAME"/>
           <w:id w:val="260968358"/>
           <w:placeholder>
@@ -20368,14 +20214,6 @@
         <w:sdtEndPr/>
         <w:sdtContent>
           <w:r>
-            <w:rPr>
-              <w:rFonts w:ascii="Times New Roman" w:hAnsi="Times New Roman"/>
-              <w:iCs/>
-              <w:color w:val="auto"/>
-              <w:sz w:val="24"/>
-              <w:szCs w:val="24"/>
-              <w:lang w:val="en-US"/>
-            </w:rPr>
             <w:t>${ASF_SHORT_NAME}</w:t>
           </w:r>
         </w:sdtContent>
@@ -20383,38 +20221,15 @@
     </w:p>
     <w:p>
       <w:pPr>
-        <w:spacing w:after="0"/>
         <w:jc w:val="center"/>
       </w:pPr>
       <w:r>
-        <w:rPr>
-          <w:lang w:val="en-US"/>
-        </w:rPr>
-        <w:t>ASF</w:t>
-      </w:r>
-      <w:r>
-        <w:rPr>
-          <w:lang w:val="en-US"/>
-        </w:rPr>
-        <w:t>_IMAGE_</w:t>
-      </w:r>
-      <w:r>
-        <w:rPr>
-          <w:lang w:val="en-US"/>
-        </w:rPr>
-        <w:t>2</w:t>
-      </w:r>
-      <w:r>
-        <w:rPr>
-          <w:lang w:val="en-US"/>
-        </w:rPr>
-        <w:t>_</w:t>
-      </w:r>
-      <w:r>
-        <w:rPr>
-          <w:lang w:val="en-US"/>
-        </w:rPr>
-        <w:t>APPENDIX</w:t>
+        <w:t>ASF_IM</w:t>
+      </w:r>
+      <w:bookmarkStart w:id="140" w:name="_GoBack"/>
+      <w:bookmarkEnd w:id="140"/>
+      <w:r>
+        <w:t>AGE_2_APPENDIX</w:t>
       </w:r>
     </w:p>
     <w:sectPr>
@@ -28952,6 +28767,7 @@
     <w:rsid w:val="00A12B88"/>
     <w:rsid w:val="00A31763"/>
     <w:rsid w:val="00A37A20"/>
+    <w:rsid w:val="00A6198B"/>
     <w:rsid w:val="00B63816"/>
     <w:rsid w:val="00B66477"/>
     <w:rsid w:val="00C10959"/>
@@ -30012,7 +29828,7 @@
 </file>
 
 <file path=customXml/itemProps1.xml><?xml version="1.0" encoding="utf-8"?>
-<ds:datastoreItem xmlns:ds="http://schemas.openxmlformats.org/officeDocument/2006/customXml" ds:itemID="{021049C3-34D6-4371-8E29-AB4310B6B1C8}">
+<ds:datastoreItem xmlns:ds="http://schemas.openxmlformats.org/officeDocument/2006/customXml" ds:itemID="{0C4B783D-EC8F-4723-996E-F6A06D57E4FA}">
   <ds:schemaRefs>
     <ds:schemaRef ds:uri="http://schemas.openxmlformats.org/officeDocument/2006/bibliography"/>
   </ds:schemaRefs>

</xml_diff>

<commit_message>
Added implementation of all user tables.
Implemented deletion only by the administrator. Fixed navigation. Reworked the script logic for the OPO. Changed the WORD template.
</commit_message>
<xml_diff>
--- a/src/main/webapp/WEB-INF/template/tagtemplate.docx
+++ b/src/main/webapp/WEB-INF/template/tagtemplate.docx
@@ -19,7 +19,6 @@
         </w:placeholder>
         <w:text/>
       </w:sdtPr>
-      <w:sdtEndPr/>
       <w:sdtContent>
         <w:p>
           <w:pPr>
@@ -143,7 +142,6 @@
               </w:placeholder>
               <w:text/>
             </w:sdtPr>
-            <w:sdtEndPr/>
             <w:sdtContent>
               <w:p>
                 <w:pPr>
@@ -179,7 +177,6 @@
               </w:placeholder>
               <w:text/>
             </w:sdtPr>
-            <w:sdtEndPr/>
             <w:sdtContent>
               <w:p>
                 <w:pPr>
@@ -251,7 +248,6 @@
               </w:placeholder>
               <w:text/>
             </w:sdtPr>
-            <w:sdtEndPr/>
             <w:sdtContent>
               <w:p>
                 <w:pPr>
@@ -288,7 +284,6 @@
               </w:placeholder>
               <w:text/>
             </w:sdtPr>
-            <w:sdtEndPr/>
             <w:sdtContent>
               <w:p>
                 <w:pPr>
@@ -359,7 +354,6 @@
                 </w:placeholder>
                 <w:text/>
               </w:sdtPr>
-              <w:sdtEndPr/>
               <w:sdtContent>
                 <w:r>
                   <w:rPr>
@@ -452,7 +446,6 @@
                 </w:placeholder>
                 <w:text/>
               </w:sdtPr>
-              <w:sdtEndPr/>
               <w:sdtContent>
                 <w:r>
                   <w:rPr>
@@ -663,7 +656,6 @@
         </w:placeholder>
         <w:text/>
       </w:sdtPr>
-      <w:sdtEndPr/>
       <w:sdtContent>
         <w:p>
           <w:pPr>
@@ -961,7 +953,6 @@
           <w:docPartUnique/>
         </w:docPartObj>
       </w:sdtPr>
-      <w:sdtEndPr/>
       <w:sdtContent>
         <w:p>
           <w:pPr>
@@ -4788,7 +4779,6 @@
           </w:placeholder>
           <w:text/>
         </w:sdtPr>
-        <w:sdtEndPr/>
         <w:sdtContent>
           <w:r>
             <w:rPr>
@@ -5355,7 +5345,6 @@
           </w:placeholder>
           <w:text/>
         </w:sdtPr>
-        <w:sdtEndPr/>
         <w:sdtContent>
           <w:r>
             <w:rPr>
@@ -5484,7 +5473,6 @@
           </w:placeholder>
           <w:text/>
         </w:sdtPr>
-        <w:sdtEndPr/>
         <w:sdtContent>
           <w:r>
             <w:t>${OBJ_ADDRESS_FULL}</w:t>
@@ -5509,7 +5497,6 @@
           </w:placeholder>
           <w:text/>
         </w:sdtPr>
-        <w:sdtEndPr/>
         <w:sdtContent>
           <w:r>
             <w:rPr>
@@ -5549,7 +5536,6 @@
           </w:placeholder>
           <w:text/>
         </w:sdtPr>
-        <w:sdtEndPr/>
         <w:sdtContent>
           <w:r>
             <w:rPr>
@@ -5633,7 +5619,6 @@
           </w:placeholder>
           <w:text/>
         </w:sdtPr>
-        <w:sdtEndPr/>
         <w:sdtContent>
           <w:r>
             <w:rPr>
@@ -5682,7 +5667,6 @@
           </w:placeholder>
           <w:text/>
         </w:sdtPr>
-        <w:sdtEndPr/>
         <w:sdtContent>
           <w:r>
             <w:rPr>
@@ -5756,7 +5740,6 @@
           </w:placeholder>
           <w:text/>
         </w:sdtPr>
-        <w:sdtEndPr/>
         <w:sdtContent>
           <w:r>
             <w:rPr>
@@ -5838,7 +5821,6 @@
           </w:placeholder>
           <w:text/>
         </w:sdtPr>
-        <w:sdtEndPr/>
         <w:sdtContent>
           <w:r>
             <w:rPr>
@@ -5888,7 +5870,6 @@
           </w:placeholder>
           <w:text/>
         </w:sdtPr>
-        <w:sdtEndPr/>
         <w:sdtContent>
           <w:r>
             <w:rPr>
@@ -5930,7 +5911,6 @@
           </w:placeholder>
           <w:text/>
         </w:sdtPr>
-        <w:sdtEndPr/>
         <w:sdtContent>
           <w:r>
             <w:rPr>
@@ -6011,12 +5991,18 @@
         <w:spacing w:after="0" w:line="240" w:lineRule="auto"/>
         <w:ind w:firstLine="708"/>
         <w:jc w:val="both"/>
+      </w:pPr>
+      <w:r>
+        <w:t>ОПО</w:t>
+      </w:r>
+      <w:r>
         <w:rPr>
           <w:lang w:val="en-US"/>
         </w:rPr>
-      </w:pPr>
-      <w:r>
-        <w:t>ОПО</w:t>
+        <w:t xml:space="preserve"> </w:t>
+      </w:r>
+      <w:r>
+        <w:t>можно</w:t>
       </w:r>
       <w:r>
         <w:rPr>
@@ -6025,7 +6011,7 @@
         <w:t xml:space="preserve"> </w:t>
       </w:r>
       <w:r>
-        <w:t>можно</w:t>
+        <w:t>условно</w:t>
       </w:r>
       <w:r>
         <w:rPr>
@@ -6034,7 +6020,7 @@
         <w:t xml:space="preserve"> </w:t>
       </w:r>
       <w:r>
-        <w:t>условно</w:t>
+        <w:t>разделить</w:t>
       </w:r>
       <w:r>
         <w:rPr>
@@ -6043,7 +6029,7 @@
         <w:t xml:space="preserve"> </w:t>
       </w:r>
       <w:r>
-        <w:t>разделить</w:t>
+        <w:t>на</w:t>
       </w:r>
       <w:r>
         <w:rPr>
@@ -6051,20 +6037,9 @@
         </w:rPr>
         <w:t xml:space="preserve"> </w:t>
       </w:r>
-      <w:r>
-        <w:t>на</w:t>
-      </w:r>
-      <w:r>
-        <w:rPr>
-          <w:lang w:val="en-US"/>
-        </w:rPr>
-        <w:t xml:space="preserve"> </w:t>
-      </w:r>
+      <w:bookmarkStart w:id="15" w:name="_GoBack"/>
       <w:sdt>
         <w:sdtPr>
-          <w:rPr>
-            <w:lang w:val="en-US"/>
-          </w:rPr>
           <w:tag w:val="OBJ_AMOUNT_TECHNOLOGICAL_BLOCK"/>
           <w:id w:val="-968664416"/>
           <w:placeholder>
@@ -6072,49 +6047,31 @@
           </w:placeholder>
           <w:text/>
         </w:sdtPr>
-        <w:sdtEndPr/>
         <w:sdtContent>
           <w:r>
-            <w:rPr>
-              <w:lang w:val="en-US"/>
-            </w:rPr>
             <w:t>${OBJ_AMOUNT_TECHNOLOGICAL_BLOCK}</w:t>
           </w:r>
         </w:sdtContent>
       </w:sdt>
       <w:r>
-        <w:rPr>
-          <w:lang w:val="en-US"/>
-        </w:rPr>
         <w:t>:</w:t>
       </w:r>
       <w:r>
-        <w:rPr>
-          <w:lang w:val="en-US"/>
-        </w:rPr>
         <w:t xml:space="preserve"> </w:t>
       </w:r>
     </w:p>
     <w:p>
       <w:pPr>
         <w:spacing w:after="0" w:line="240" w:lineRule="auto"/>
-        <w:rPr>
-          <w:lang w:val="en-US"/>
-        </w:rPr>
-      </w:pPr>
-      <w:r>
-        <w:rPr>
-          <w:lang w:val="en-US"/>
-        </w:rPr>
+      </w:pPr>
+      <w:r>
         <w:t>OBJ_TECHNO_BLOCK_LIST</w:t>
       </w:r>
       <w:r>
-        <w:rPr>
-          <w:lang w:val="en-US"/>
-        </w:rPr>
         <w:t>№</w:t>
       </w:r>
     </w:p>
+    <w:bookmarkEnd w:id="15"/>
     <w:p>
       <w:pPr>
         <w:spacing w:after="0" w:line="240" w:lineRule="auto"/>
@@ -6129,7 +6086,6 @@
         <w:ind w:firstLine="708"/>
         <w:rPr>
           <w:bCs/>
-          <w:lang w:val="en-US"/>
         </w:rPr>
         <w:sectPr>
           <w:pgSz w:w="11906" w:h="16838"/>
@@ -6140,9 +6096,6 @@
       </w:pPr>
       <w:sdt>
         <w:sdtPr>
-          <w:rPr>
-            <w:lang w:val="en-US"/>
-          </w:rPr>
           <w:tag w:val="OBJ_LINC_TEXT_2_IMAGE"/>
           <w:id w:val="935785831"/>
           <w:placeholder>
@@ -6150,27 +6103,17 @@
           </w:placeholder>
           <w:text/>
         </w:sdtPr>
-        <w:sdtEndPr/>
         <w:sdtContent>
           <w:r>
-            <w:rPr>
-              <w:lang w:val="en-US"/>
-            </w:rPr>
             <w:t>${OBJ_LINC_TEXT_2_IMAGE}</w:t>
           </w:r>
         </w:sdtContent>
       </w:sdt>
       <w:r>
-        <w:rPr>
-          <w:lang w:val="en-US"/>
-        </w:rPr>
         <w:t xml:space="preserve"> </w:t>
       </w:r>
       <w:sdt>
         <w:sdtPr>
-          <w:rPr>
-            <w:lang w:val="en-US"/>
-          </w:rPr>
           <w:tag w:val="OBJ_NUM_2_IMAGE"/>
           <w:id w:val="-472054734"/>
           <w:placeholder>
@@ -6178,20 +6121,13 @@
           </w:placeholder>
           <w:text/>
         </w:sdtPr>
-        <w:sdtEndPr/>
         <w:sdtContent>
           <w:r>
-            <w:rPr>
-              <w:lang w:val="en-US"/>
-            </w:rPr>
             <w:t>${OBJ_NUM_2_IMAGE}</w:t>
           </w:r>
         </w:sdtContent>
       </w:sdt>
       <w:r>
-        <w:rPr>
-          <w:lang w:val="en-US"/>
-        </w:rPr>
         <w:t>.</w:t>
       </w:r>
     </w:p>
@@ -6199,14 +6135,14 @@
       <w:pPr>
         <w:pStyle w:val="2a"/>
       </w:pPr>
-      <w:bookmarkStart w:id="15" w:name="_Toc209703487"/>
-      <w:bookmarkStart w:id="16" w:name="_Toc221000960"/>
+      <w:bookmarkStart w:id="16" w:name="_Toc209703487"/>
+      <w:bookmarkStart w:id="17" w:name="_Toc221000960"/>
       <w:r>
         <w:lastRenderedPageBreak/>
         <w:t>1.1. Перечень основного технологического оборудования ОПО</w:t>
       </w:r>
-      <w:bookmarkEnd w:id="15"/>
       <w:bookmarkEnd w:id="16"/>
+      <w:bookmarkEnd w:id="17"/>
     </w:p>
     <w:p>
       <w:pPr>
@@ -6223,7 +6159,6 @@
           </w:placeholder>
           <w:text/>
         </w:sdtPr>
-        <w:sdtEndPr/>
         <w:sdtContent>
           <w:r>
             <w:t>${OBJ_LINC_TEXT_1_TABLE}</w:t>
@@ -6242,7 +6177,6 @@
           </w:placeholder>
           <w:text/>
         </w:sdtPr>
-        <w:sdtEndPr/>
         <w:sdtContent>
           <w:r>
             <w:t>${OBJ_NUM_1_TABLE}</w:t>
@@ -6280,9 +6214,6 @@
       </w:r>
       <w:sdt>
         <w:sdtPr>
-          <w:rPr>
-            <w:lang w:val="en-US"/>
-          </w:rPr>
           <w:tag w:val="OBJ_NUM_1_TABLE"/>
           <w:id w:val="606242610"/>
           <w:placeholder>
@@ -6290,45 +6221,17 @@
           </w:placeholder>
           <w:text/>
         </w:sdtPr>
-        <w:sdtEndPr/>
         <w:sdtContent>
           <w:r>
-            <w:rPr>
-              <w:lang w:val="en-US"/>
-            </w:rPr>
-            <w:t>${OBJ_NUM_</w:t>
-          </w:r>
-          <w:r>
-            <w:rPr>
-              <w:lang w:val="en-US"/>
-            </w:rPr>
-            <w:t>1</w:t>
-          </w:r>
-          <w:r>
-            <w:rPr>
-              <w:lang w:val="en-US"/>
-            </w:rPr>
-            <w:t>_TABLE</w:t>
-          </w:r>
-          <w:r>
-            <w:rPr>
-              <w:lang w:val="en-US"/>
-            </w:rPr>
-            <w:t>}</w:t>
+            <w:t>${OBJ_NUM_1_TABLE}</w:t>
           </w:r>
         </w:sdtContent>
       </w:sdt>
       <w:r>
-        <w:rPr>
-          <w:lang w:val="en-US"/>
-        </w:rPr>
         <w:t xml:space="preserve"> – </w:t>
       </w:r>
       <w:sdt>
         <w:sdtPr>
-          <w:rPr>
-            <w:lang w:val="en-US"/>
-          </w:rPr>
           <w:tag w:val="OBJ_TEXT_NAME_1_TABLE"/>
           <w:id w:val="1895999250"/>
           <w:placeholder>
@@ -6336,25 +6239,9 @@
           </w:placeholder>
           <w:text/>
         </w:sdtPr>
-        <w:sdtEndPr/>
         <w:sdtContent>
           <w:r>
-            <w:rPr>
-              <w:lang w:val="en-US"/>
-            </w:rPr>
-            <w:t>${</w:t>
-          </w:r>
-          <w:r>
-            <w:rPr>
-              <w:lang w:val="en-US"/>
-            </w:rPr>
-            <w:t>OBJ_TEXT_NAME_1_TABLE</w:t>
-          </w:r>
-          <w:r>
-            <w:rPr>
-              <w:lang w:val="en-US"/>
-            </w:rPr>
-            <w:t>}</w:t>
+            <w:t>${OBJ_TEXT_NAME_1_TABLE}</w:t>
           </w:r>
         </w:sdtContent>
       </w:sdt>
@@ -6407,12 +6294,12 @@
                 <w:b/>
               </w:rPr>
             </w:pPr>
-            <w:bookmarkStart w:id="17" w:name="_Toc335836262"/>
-            <w:bookmarkStart w:id="18" w:name="_Toc346009609"/>
-            <w:bookmarkStart w:id="19" w:name="_Toc363560121"/>
-            <w:bookmarkStart w:id="20" w:name="_Toc368475301"/>
-            <w:bookmarkStart w:id="21" w:name="_Toc392754508"/>
-            <w:bookmarkStart w:id="22" w:name="_Toc430255933"/>
+            <w:bookmarkStart w:id="18" w:name="_Toc335836262"/>
+            <w:bookmarkStart w:id="19" w:name="_Toc346009609"/>
+            <w:bookmarkStart w:id="20" w:name="_Toc363560121"/>
+            <w:bookmarkStart w:id="21" w:name="_Toc368475301"/>
+            <w:bookmarkStart w:id="22" w:name="_Toc392754508"/>
+            <w:bookmarkStart w:id="23" w:name="_Toc430255933"/>
             <w:r>
               <w:rPr>
                 <w:b/>
@@ -6556,38 +6443,34 @@
           </w:placeholder>
           <w:text/>
         </w:sdtPr>
-        <w:sdtEndPr/>
         <w:sdtContent>
           <w:r>
             <w:t>${OBJ_AMOUNT_HAZARDOUS_SUBSTANCE}</w:t>
           </w:r>
         </w:sdtContent>
       </w:sdt>
-      <w:r>
-        <w:t>.</w:t>
-      </w:r>
     </w:p>
     <w:p>
       <w:pPr>
         <w:pStyle w:val="2a"/>
       </w:pPr>
-      <w:bookmarkStart w:id="23" w:name="_Toc209703488"/>
-      <w:bookmarkStart w:id="24" w:name="_Toc221000961"/>
+      <w:bookmarkStart w:id="24" w:name="_Toc209703488"/>
+      <w:bookmarkStart w:id="25" w:name="_Toc221000961"/>
       <w:r>
         <w:lastRenderedPageBreak/>
         <w:t xml:space="preserve">1.2. Характеристика опасных веществ, обращающихся на </w:t>
       </w:r>
-      <w:bookmarkEnd w:id="17"/>
       <w:bookmarkEnd w:id="18"/>
       <w:bookmarkEnd w:id="19"/>
       <w:bookmarkEnd w:id="20"/>
       <w:bookmarkEnd w:id="21"/>
       <w:bookmarkEnd w:id="22"/>
       <w:bookmarkEnd w:id="23"/>
+      <w:bookmarkEnd w:id="24"/>
       <w:r>
         <w:t>объекте</w:t>
       </w:r>
-      <w:bookmarkEnd w:id="24"/>
+      <w:bookmarkEnd w:id="25"/>
     </w:p>
     <w:p>
       <w:pPr>
@@ -6625,7 +6508,6 @@
           </w:placeholder>
           <w:text/>
         </w:sdtPr>
-        <w:sdtEndPr/>
         <w:sdtContent>
           <w:r>
             <w:t>${OBJ_HAZARDOUS_SUBSTANCE}</w:t>
@@ -6644,7 +6526,6 @@
           </w:placeholder>
           <w:text/>
         </w:sdtPr>
-        <w:sdtEndPr/>
         <w:sdtContent>
           <w:r>
             <w:t>${OBJ_LINC_TEXT_</w:t>
@@ -6669,7 +6550,6 @@
           </w:placeholder>
           <w:text/>
         </w:sdtPr>
-        <w:sdtEndPr/>
         <w:sdtContent>
           <w:r>
             <w:t>${OBJ_NUM_2_TABLE}</w:t>
@@ -6716,7 +6596,6 @@
           </w:placeholder>
           <w:text/>
         </w:sdtPr>
-        <w:sdtEndPr/>
         <w:sdtContent>
           <w:r>
             <w:rPr>
@@ -6762,7 +6641,6 @@
           </w:placeholder>
           <w:text/>
         </w:sdtPr>
-        <w:sdtEndPr/>
         <w:sdtContent>
           <w:r>
             <w:rPr>
@@ -6814,7 +6692,6 @@
           </w:placeholder>
           <w:text/>
         </w:sdtPr>
-        <w:sdtEndPr/>
         <w:sdtContent>
           <w:r>
             <w:rPr>
@@ -7038,8 +6915,8 @@
       <w:pPr>
         <w:pStyle w:val="2a"/>
       </w:pPr>
-      <w:bookmarkStart w:id="25" w:name="_Toc209703489"/>
-      <w:bookmarkStart w:id="26" w:name="_Toc221000962"/>
+      <w:bookmarkStart w:id="26" w:name="_Toc209703489"/>
+      <w:bookmarkStart w:id="27" w:name="_Toc221000962"/>
       <w:r>
         <w:lastRenderedPageBreak/>
         <w:t>1.3 К</w:t>
@@ -7062,8 +6939,8 @@
       <w:r>
         <w:t>ОПО</w:t>
       </w:r>
-      <w:bookmarkEnd w:id="25"/>
       <w:bookmarkEnd w:id="26"/>
+      <w:bookmarkEnd w:id="27"/>
     </w:p>
     <w:p>
       <w:pPr>
@@ -7144,7 +7021,6 @@
           </w:placeholder>
           <w:text/>
         </w:sdtPr>
-        <w:sdtEndPr/>
         <w:sdtContent>
           <w:r>
             <w:rPr>
@@ -7196,7 +7072,6 @@
           </w:placeholder>
           <w:text/>
         </w:sdtPr>
-        <w:sdtEndPr/>
         <w:sdtContent>
           <w:r>
             <w:rPr>
@@ -7299,7 +7174,6 @@
           </w:placeholder>
           <w:text/>
         </w:sdtPr>
-        <w:sdtEndPr/>
         <w:sdtContent>
           <w:r>
             <w:rPr>
@@ -7339,7 +7213,6 @@
           </w:placeholder>
           <w:text/>
         </w:sdtPr>
-        <w:sdtEndPr/>
         <w:sdtContent>
           <w:r>
             <w:rPr>
@@ -7399,33 +7272,33 @@
         <w:pStyle w:val="1"/>
         <w:ind w:firstLine="0"/>
       </w:pPr>
-      <w:bookmarkStart w:id="27" w:name="_Toc392754513"/>
-      <w:bookmarkStart w:id="28" w:name="_Toc430097609"/>
-      <w:bookmarkStart w:id="29" w:name="_Toc430255936"/>
-      <w:bookmarkStart w:id="30" w:name="_Toc209703490"/>
-      <w:bookmarkStart w:id="31" w:name="_Toc221000963"/>
+      <w:bookmarkStart w:id="28" w:name="_Toc392754513"/>
+      <w:bookmarkStart w:id="29" w:name="_Toc430097609"/>
+      <w:bookmarkStart w:id="30" w:name="_Toc430255936"/>
+      <w:bookmarkStart w:id="31" w:name="_Toc209703490"/>
+      <w:bookmarkStart w:id="32" w:name="_Toc221000963"/>
       <w:r>
         <w:lastRenderedPageBreak/>
         <w:t xml:space="preserve">2. Анализ опасности </w:t>
       </w:r>
-      <w:bookmarkEnd w:id="27"/>
       <w:bookmarkEnd w:id="28"/>
       <w:bookmarkEnd w:id="29"/>
       <w:bookmarkEnd w:id="30"/>
+      <w:bookmarkEnd w:id="31"/>
       <w:r>
         <w:t>объекта</w:t>
       </w:r>
-      <w:bookmarkEnd w:id="31"/>
+      <w:bookmarkEnd w:id="32"/>
     </w:p>
     <w:p>
       <w:pPr>
         <w:pStyle w:val="2a"/>
       </w:pPr>
-      <w:bookmarkStart w:id="32" w:name="_Toc392754514"/>
-      <w:bookmarkStart w:id="33" w:name="_Toc430097610"/>
-      <w:bookmarkStart w:id="34" w:name="_Toc430255937"/>
-      <w:bookmarkStart w:id="35" w:name="_Toc209703491"/>
-      <w:bookmarkStart w:id="36" w:name="_Toc221000964"/>
+      <w:bookmarkStart w:id="33" w:name="_Toc392754514"/>
+      <w:bookmarkStart w:id="34" w:name="_Toc430097610"/>
+      <w:bookmarkStart w:id="35" w:name="_Toc430255937"/>
+      <w:bookmarkStart w:id="36" w:name="_Toc209703491"/>
+      <w:bookmarkStart w:id="37" w:name="_Toc221000964"/>
       <w:r>
         <w:t xml:space="preserve">2.1. </w:t>
       </w:r>
@@ -7453,11 +7326,11 @@
       <w:r>
         <w:t xml:space="preserve"> возникновения</w:t>
       </w:r>
-      <w:bookmarkEnd w:id="32"/>
       <w:bookmarkEnd w:id="33"/>
       <w:bookmarkEnd w:id="34"/>
       <w:bookmarkEnd w:id="35"/>
       <w:bookmarkEnd w:id="36"/>
+      <w:bookmarkEnd w:id="37"/>
     </w:p>
     <w:p>
       <w:pPr>
@@ -7548,94 +7421,17 @@
     <w:p>
       <w:pPr>
         <w:spacing w:after="0" w:line="240" w:lineRule="auto"/>
-        <w:ind w:firstLine="709"/>
-        <w:jc w:val="both"/>
-      </w:pPr>
-      <w:r>
+        <w:ind w:right="-2" w:firstLine="720"/>
+        <w:jc w:val="both"/>
         <w:rPr>
           <w:b/>
         </w:rPr>
-        <w:t>Сценарий 1 (С</w:t>
-      </w:r>
+      </w:pPr>
       <w:r>
         <w:rPr>
           <w:b/>
-          <w:vertAlign w:val="subscript"/>
-        </w:rPr>
-        <w:t>1</w:t>
-      </w:r>
-      <w:r>
-        <w:rPr>
-          <w:b/>
-        </w:rPr>
-        <w:t>)</w:t>
-      </w:r>
-      <w:r>
-        <w:t xml:space="preserve"> – разрыв трубопровода (разрушение оборудования) с природным газом, истечение газа без возгорания;</w:t>
-      </w:r>
-    </w:p>
-    <w:p>
-      <w:pPr>
-        <w:spacing w:after="0" w:line="240" w:lineRule="auto"/>
-        <w:ind w:firstLine="709"/>
-        <w:jc w:val="both"/>
-      </w:pPr>
-      <w:r>
-        <w:rPr>
-          <w:b/>
-        </w:rPr>
-        <w:t>Сценарий 2 (С</w:t>
-      </w:r>
-      <w:r>
-        <w:rPr>
-          <w:b/>
-          <w:vertAlign w:val="subscript"/>
-        </w:rPr>
-        <w:t>2</w:t>
-      </w:r>
-      <w:r>
-        <w:rPr>
-          <w:b/>
-        </w:rPr>
-        <w:t>)</w:t>
-      </w:r>
-      <w:r>
-        <w:t xml:space="preserve"> – пожар в «котловане» - горение «колонного» шлейфа газа, истекающего из котлована, образующегося в результате разрушения газопровода;</w:t>
-      </w:r>
-    </w:p>
-    <w:p>
-      <w:pPr>
-        <w:spacing w:after="0" w:line="240" w:lineRule="auto"/>
-        <w:ind w:firstLine="709"/>
-        <w:jc w:val="both"/>
-        <w:rPr>
-          <w:bCs/>
-        </w:rPr>
-      </w:pPr>
-      <w:r>
-        <w:rPr>
-          <w:b/>
-        </w:rPr>
-        <w:t>Сценарий 3 (С</w:t>
-      </w:r>
-      <w:r>
-        <w:rPr>
-          <w:b/>
-          <w:vertAlign w:val="subscript"/>
-        </w:rPr>
-        <w:t>3</w:t>
-      </w:r>
-      <w:r>
-        <w:rPr>
-          <w:b/>
-        </w:rPr>
-        <w:t xml:space="preserve">) </w:t>
-      </w:r>
-      <w:r>
-        <w:rPr>
-          <w:bCs/>
-        </w:rPr>
-        <w:t>– взрыв ТВС в открытом пространстве;</w:t>
+        </w:rPr>
+        <w:t>Наиболее вероятные сценарии:</w:t>
       </w:r>
     </w:p>
     <w:p>
@@ -7644,45 +7440,53 @@
         <w:ind w:right="-2" w:firstLine="720"/>
         <w:jc w:val="both"/>
         <w:rPr>
-          <w:bCs/>
-        </w:rPr>
-      </w:pPr>
-      <w:r>
-        <w:rPr>
           <w:b/>
         </w:rPr>
-        <w:t>Сценарий 4 (С</w:t>
-      </w:r>
-      <w:r>
-        <w:rPr>
-          <w:b/>
-          <w:vertAlign w:val="subscript"/>
-        </w:rPr>
-        <w:t>4</w:t>
-      </w:r>
-      <w:r>
-        <w:rPr>
-          <w:b/>
-        </w:rPr>
-        <w:t xml:space="preserve">) </w:t>
-      </w:r>
-      <w:r>
-        <w:rPr>
-          <w:bCs/>
-        </w:rPr>
-        <w:t xml:space="preserve">– образование и взрыв </w:t>
-      </w:r>
-      <w:r>
-        <w:rPr>
-          <w:bCs/>
-        </w:rPr>
-        <w:t>Т</w:t>
-      </w:r>
-      <w:r>
-        <w:rPr>
-          <w:bCs/>
-        </w:rPr>
-        <w:t>ВС в помещении;</w:t>
+      </w:pPr>
+      <w:r>
+        <w:rPr>
+          <w:lang w:val="en-US"/>
+        </w:rPr>
+        <w:t>OBJ</w:t>
+      </w:r>
+      <w:r>
+        <w:t>_</w:t>
+      </w:r>
+      <w:r>
+        <w:rPr>
+          <w:lang w:val="en-US"/>
+        </w:rPr>
+        <w:t>SCENARIO</w:t>
+      </w:r>
+      <w:r>
+        <w:t>_</w:t>
+      </w:r>
+      <w:r>
+        <w:rPr>
+          <w:lang w:val="en-US"/>
+        </w:rPr>
+        <w:t>L</w:t>
+      </w:r>
+      <w:r>
+        <w:rPr>
+          <w:lang w:val="en-US"/>
+        </w:rPr>
+        <w:t>I</w:t>
+      </w:r>
+      <w:r>
+        <w:rPr>
+          <w:lang w:val="en-US"/>
+        </w:rPr>
+        <w:t>KELY</w:t>
+      </w:r>
+      <w:r>
+        <w:t>_</w:t>
+      </w:r>
+      <w:r>
+        <w:rPr>
+          <w:lang w:val="en-US"/>
+        </w:rPr>
+        <w:t>LIST</w:t>
       </w:r>
     </w:p>
     <w:p>
@@ -7691,33 +7495,14 @@
         <w:ind w:right="-2" w:firstLine="720"/>
         <w:jc w:val="both"/>
         <w:rPr>
-          <w:bCs/>
-        </w:rPr>
-      </w:pPr>
-      <w:r>
-        <w:rPr>
           <w:b/>
         </w:rPr>
-        <w:t>Сценарий 5 (С</w:t>
-      </w:r>
+      </w:pPr>
       <w:r>
         <w:rPr>
           <w:b/>
-          <w:vertAlign w:val="subscript"/>
-        </w:rPr>
-        <w:t>5</w:t>
-      </w:r>
-      <w:r>
-        <w:rPr>
-          <w:b/>
-        </w:rPr>
-        <w:t xml:space="preserve">) </w:t>
-      </w:r>
-      <w:r>
-        <w:rPr>
-          <w:bCs/>
-        </w:rPr>
-        <w:t>– пожар газа в помещении;</w:t>
+        </w:rPr>
+        <w:t>Наиболее опасные по последствиям ЧС сценарии:</w:t>
       </w:r>
     </w:p>
     <w:p>
@@ -7725,12 +7510,59 @@
         <w:spacing w:after="0" w:line="240" w:lineRule="auto"/>
         <w:ind w:right="-2" w:firstLine="720"/>
         <w:jc w:val="both"/>
-      </w:pPr>
-      <w:r>
-        <w:t>При анализе обобщённых сценариев аварий можно выделить специальные сценарии, относящиеся непосредственно к Объекту.</w:t>
-      </w:r>
-    </w:p>
-    <w:bookmarkStart w:id="37" w:name="_Hlk221785402"/>
+        <w:rPr>
+          <w:bCs/>
+          <w:lang w:val="en-US"/>
+        </w:rPr>
+      </w:pPr>
+      <w:r>
+        <w:rPr>
+          <w:lang w:val="en-US"/>
+        </w:rPr>
+        <w:t>OBJ_</w:t>
+      </w:r>
+      <w:r>
+        <w:rPr>
+          <w:lang w:val="en-US"/>
+        </w:rPr>
+        <w:t>SCENARIO</w:t>
+      </w:r>
+      <w:r>
+        <w:rPr>
+          <w:lang w:val="en-US"/>
+        </w:rPr>
+        <w:t>_</w:t>
+      </w:r>
+      <w:r>
+        <w:rPr>
+          <w:lang w:val="en-US"/>
+        </w:rPr>
+        <w:t>DANGEROUS</w:t>
+      </w:r>
+      <w:r>
+        <w:rPr>
+          <w:lang w:val="en-US"/>
+        </w:rPr>
+        <w:t>_</w:t>
+      </w:r>
+      <w:r>
+        <w:rPr>
+          <w:lang w:val="en-US"/>
+        </w:rPr>
+        <w:t>LIST</w:t>
+      </w:r>
+    </w:p>
+    <w:p>
+      <w:pPr>
+        <w:spacing w:after="0" w:line="240" w:lineRule="auto"/>
+        <w:ind w:right="-2" w:firstLine="720"/>
+        <w:jc w:val="both"/>
+        <w:rPr>
+          <w:lang w:val="en-US"/>
+        </w:rPr>
+      </w:pPr>
+      <w:bookmarkStart w:id="38" w:name="_Hlk221785402"/>
+    </w:p>
     <w:p>
       <w:pPr>
         <w:spacing w:after="0" w:line="240" w:lineRule="auto"/>
@@ -7752,7 +7584,6 @@
           </w:placeholder>
           <w:text/>
         </w:sdtPr>
-        <w:sdtEndPr/>
         <w:sdtContent>
           <w:r>
             <w:rPr>
@@ -7774,7 +7605,7 @@
           </w:r>
         </w:sdtContent>
       </w:sdt>
-      <w:bookmarkEnd w:id="37"/>
+      <w:bookmarkEnd w:id="38"/>
       <w:r>
         <w:rPr>
           <w:lang w:val="en-US"/>
@@ -7793,7 +7624,6 @@
           </w:placeholder>
           <w:text/>
         </w:sdtPr>
-        <w:sdtEndPr/>
         <w:sdtContent>
           <w:r>
             <w:rPr>
@@ -7837,7 +7667,7 @@
         </w:rPr>
         <w:t xml:space="preserve"> </w:t>
       </w:r>
-      <w:bookmarkStart w:id="38" w:name="_Hlk221870690"/>
+      <w:bookmarkStart w:id="39" w:name="_Hlk221870690"/>
       <w:sdt>
         <w:sdtPr>
           <w:rPr>
@@ -7850,7 +7680,6 @@
           </w:placeholder>
           <w:text/>
         </w:sdtPr>
-        <w:sdtEndPr/>
         <w:sdtContent>
           <w:r>
             <w:rPr>
@@ -7860,7 +7689,7 @@
           </w:r>
         </w:sdtContent>
       </w:sdt>
-      <w:bookmarkEnd w:id="38"/>
+      <w:bookmarkEnd w:id="39"/>
       <w:r>
         <w:rPr>
           <w:lang w:val="en-US"/>
@@ -7879,7 +7708,6 @@
           </w:placeholder>
           <w:text/>
         </w:sdtPr>
-        <w:sdtEndPr/>
         <w:sdtContent>
           <w:r>
             <w:rPr>
@@ -7912,7 +7740,7 @@
     </w:p>
     <w:tbl>
       <w:tblPr>
-        <w:tblW w:w="9498" w:type="dxa"/>
+        <w:tblW w:w="9493" w:type="dxa"/>
         <w:tblBorders>
           <w:top w:val="single" w:sz="4" w:space="0" w:color="auto"/>
           <w:left w:val="single" w:sz="4" w:space="0" w:color="auto"/>
@@ -7926,7 +7754,8 @@
       </w:tblPr>
       <w:tblGrid>
         <w:gridCol w:w="2448"/>
-        <w:gridCol w:w="7050"/>
+        <w:gridCol w:w="4068"/>
+        <w:gridCol w:w="2977"/>
       </w:tblGrid>
       <w:tr>
         <w:trPr>
@@ -7948,23 +7777,19 @@
               <w:jc w:val="center"/>
               <w:rPr>
                 <w:b/>
-                <w:sz w:val="22"/>
-                <w:szCs w:val="22"/>
               </w:rPr>
             </w:pPr>
             <w:r>
               <w:rPr>
                 <w:b/>
-                <w:sz w:val="22"/>
-                <w:szCs w:val="22"/>
-              </w:rPr>
-              <w:t>Сценарии</w:t>
+              </w:rPr>
+              <w:t>Сценарий</w:t>
             </w:r>
           </w:p>
         </w:tc>
         <w:tc>
           <w:tcPr>
-            <w:tcW w:w="7050" w:type="dxa"/>
+            <w:tcW w:w="4068" w:type="dxa"/>
             <w:tcBorders>
               <w:bottom w:val="single" w:sz="4" w:space="0" w:color="auto"/>
             </w:tcBorders>
@@ -7977,17 +7802,41 @@
               <w:jc w:val="center"/>
               <w:rPr>
                 <w:b/>
-                <w:sz w:val="22"/>
-                <w:szCs w:val="22"/>
               </w:rPr>
             </w:pPr>
             <w:r>
+              <w:rPr>
+                <w:b/>
+              </w:rPr>
+              <w:t>Описание сценария</w:t>
+            </w:r>
+          </w:p>
+        </w:tc>
+        <w:tc>
+          <w:tcPr>
+            <w:tcW w:w="2977" w:type="dxa"/>
+            <w:tcBorders>
+              <w:bottom w:val="single" w:sz="4" w:space="0" w:color="auto"/>
+            </w:tcBorders>
+            <w:shd w:val="pct15" w:color="auto" w:fill="auto"/>
+          </w:tcPr>
+          <w:p>
+            <w:pPr>
+              <w:spacing w:after="0" w:line="240" w:lineRule="auto"/>
+              <w:ind w:right="-108"/>
+              <w:jc w:val="center"/>
               <w:rPr>
                 <w:b/>
                 <w:sz w:val="22"/>
                 <w:szCs w:val="22"/>
               </w:rPr>
-              <w:t>Схема развития сценария</w:t>
+            </w:pPr>
+            <w:r>
+              <w:rPr>
+                <w:b/>
+                <w:bCs/>
+              </w:rPr>
+              <w:t>Опасные факторы</w:t>
             </w:r>
           </w:p>
         </w:tc>
@@ -8001,6 +7850,7 @@
           <w:p>
             <w:pPr>
               <w:spacing w:after="0" w:line="240" w:lineRule="auto"/>
+              <w:jc w:val="center"/>
             </w:pPr>
             <w:r>
               <w:t>OBJ_TABLE_3_PLACEHOLDER</w:t>
@@ -8009,7 +7859,7 @@
         </w:tc>
         <w:tc>
           <w:tcPr>
-            <w:tcW w:w="7050" w:type="dxa"/>
+            <w:tcW w:w="4068" w:type="dxa"/>
             <w:shd w:val="clear" w:color="auto" w:fill="auto"/>
           </w:tcPr>
           <w:p>
@@ -8020,6 +7870,19 @@
                 <w:sz w:val="22"/>
                 <w:szCs w:val="22"/>
               </w:rPr>
+            </w:pPr>
+            <w:r>
+              <w:t>OBJ_TABLE_3_PLACEHOLDER</w:t>
+            </w:r>
+          </w:p>
+        </w:tc>
+        <w:tc>
+          <w:tcPr>
+            <w:tcW w:w="2977" w:type="dxa"/>
+          </w:tcPr>
+          <w:p>
+            <w:pPr>
+              <w:spacing w:after="0" w:line="240" w:lineRule="auto"/>
             </w:pPr>
             <w:r>
               <w:t>OBJ_TABLE_3_PLACEHOLDER</w:t>
@@ -8054,7 +7917,6 @@
           </w:placeholder>
           <w:text/>
         </w:sdtPr>
-        <w:sdtEndPr/>
         <w:sdtContent>
           <w:r>
             <w:rPr>
@@ -8082,7 +7944,6 @@
           </w:placeholder>
           <w:text/>
         </w:sdtPr>
-        <w:sdtEndPr/>
         <w:sdtContent>
           <w:r>
             <w:rPr>
@@ -8138,7 +7999,6 @@
           </w:placeholder>
           <w:text/>
         </w:sdtPr>
-        <w:sdtEndPr/>
         <w:sdtContent>
           <w:r>
             <w:rPr>
@@ -8166,7 +8026,6 @@
           </w:placeholder>
           <w:text/>
         </w:sdtPr>
-        <w:sdtEndPr/>
         <w:sdtContent>
           <w:r>
             <w:rPr>
@@ -8200,14 +8059,13 @@
     <w:tbl>
       <w:tblPr>
         <w:tblStyle w:val="afb"/>
-        <w:tblW w:w="0" w:type="auto"/>
+        <w:tblW w:w="9493" w:type="dxa"/>
         <w:tblLayout w:type="fixed"/>
         <w:tblLook w:val="04A0" w:firstRow="1" w:lastRow="0" w:firstColumn="1" w:lastColumn="0" w:noHBand="0" w:noVBand="1"/>
       </w:tblPr>
       <w:tblGrid>
-        <w:gridCol w:w="3210"/>
-        <w:gridCol w:w="4156"/>
-        <w:gridCol w:w="2223"/>
+        <w:gridCol w:w="5665"/>
+        <w:gridCol w:w="3828"/>
       </w:tblGrid>
       <w:tr>
         <w:trPr>
@@ -8215,7 +8073,7 @@
         </w:trPr>
         <w:tc>
           <w:tcPr>
-            <w:tcW w:w="3210" w:type="dxa"/>
+            <w:tcW w:w="5665" w:type="dxa"/>
             <w:shd w:val="pct15" w:color="auto" w:fill="auto"/>
           </w:tcPr>
           <w:p>
@@ -8231,13 +8089,13 @@
                 <w:b/>
                 <w:bCs/>
               </w:rPr>
-              <w:t>Наименование оборудования в блоке</w:t>
+              <w:t>Источники (места) возникновения аварии</w:t>
             </w:r>
           </w:p>
         </w:tc>
         <w:tc>
           <w:tcPr>
-            <w:tcW w:w="4156" w:type="dxa"/>
+            <w:tcW w:w="3828" w:type="dxa"/>
             <w:shd w:val="pct15" w:color="auto" w:fill="auto"/>
           </w:tcPr>
           <w:p>
@@ -8253,29 +8111,14 @@
                 <w:b/>
                 <w:bCs/>
               </w:rPr>
-              <w:t>Событие, инициирующее аварийную ситуацию</w:t>
-            </w:r>
-          </w:p>
-        </w:tc>
-        <w:tc>
-          <w:tcPr>
-            <w:tcW w:w="2223" w:type="dxa"/>
-            <w:shd w:val="pct15" w:color="auto" w:fill="auto"/>
-          </w:tcPr>
-          <w:p>
-            <w:pPr>
-              <w:spacing w:after="0" w:line="240" w:lineRule="auto"/>
+              <w:t xml:space="preserve">Перечень </w:t>
+            </w:r>
+            <w:r>
               <w:rPr>
                 <w:b/>
                 <w:bCs/>
               </w:rPr>
-            </w:pPr>
-            <w:r>
-              <w:rPr>
-                <w:b/>
-                <w:bCs/>
-              </w:rPr>
-              <w:t>Перечень возможных типовых сценариев аварий</w:t>
+              <w:t>сценариев</w:t>
             </w:r>
           </w:p>
         </w:tc>
@@ -8283,7 +8126,7 @@
       <w:tr>
         <w:tc>
           <w:tcPr>
-            <w:tcW w:w="3210" w:type="dxa"/>
+            <w:tcW w:w="5665" w:type="dxa"/>
           </w:tcPr>
           <w:p>
             <w:pPr>
@@ -8296,20 +8139,7 @@
         </w:tc>
         <w:tc>
           <w:tcPr>
-            <w:tcW w:w="4156" w:type="dxa"/>
-          </w:tcPr>
-          <w:p>
-            <w:pPr>
-              <w:spacing w:after="0" w:line="240" w:lineRule="auto"/>
-            </w:pPr>
-            <w:r>
-              <w:t>OBJ_TABLE_4_PLACEHOLDER</w:t>
-            </w:r>
-          </w:p>
-        </w:tc>
-        <w:tc>
-          <w:tcPr>
-            <w:tcW w:w="2223" w:type="dxa"/>
+            <w:tcW w:w="3828" w:type="dxa"/>
           </w:tcPr>
           <w:p>
             <w:pPr>
@@ -8354,7 +8184,6 @@
           </w:placeholder>
           <w:text/>
         </w:sdtPr>
-        <w:sdtEndPr/>
         <w:sdtContent>
           <w:r>
             <w:rPr>
@@ -8394,7 +8223,6 @@
           </w:placeholder>
           <w:text/>
         </w:sdtPr>
-        <w:sdtEndPr/>
         <w:sdtContent>
           <w:r>
             <w:rPr>
@@ -8489,7 +8317,6 @@
           </w:placeholder>
           <w:text/>
         </w:sdtPr>
-        <w:sdtEndPr/>
         <w:sdtContent>
           <w:r>
             <w:rPr>
@@ -8529,7 +8356,6 @@
           </w:placeholder>
           <w:text/>
         </w:sdtPr>
-        <w:sdtEndPr/>
         <w:sdtContent>
           <w:r>
             <w:rPr>
@@ -8562,23 +8388,23 @@
       <w:pPr>
         <w:pStyle w:val="2a"/>
       </w:pPr>
-      <w:bookmarkStart w:id="39" w:name="_Toc392754515"/>
-      <w:bookmarkStart w:id="40" w:name="_Toc430097611"/>
-      <w:bookmarkStart w:id="41" w:name="_Toc430255938"/>
-      <w:bookmarkStart w:id="42" w:name="_Toc209703492"/>
-      <w:bookmarkStart w:id="43" w:name="_Toc221000965"/>
+      <w:bookmarkStart w:id="40" w:name="_Toc392754515"/>
+      <w:bookmarkStart w:id="41" w:name="_Toc430097611"/>
+      <w:bookmarkStart w:id="42" w:name="_Toc430255938"/>
+      <w:bookmarkStart w:id="43" w:name="_Toc209703492"/>
+      <w:bookmarkStart w:id="44" w:name="_Toc221000965"/>
       <w:r>
         <w:lastRenderedPageBreak/>
         <w:t xml:space="preserve">2.2. </w:t>
       </w:r>
-      <w:bookmarkEnd w:id="39"/>
       <w:bookmarkEnd w:id="40"/>
       <w:bookmarkEnd w:id="41"/>
       <w:bookmarkEnd w:id="42"/>
+      <w:bookmarkEnd w:id="43"/>
       <w:r>
         <w:t>Характеристики аварийности, присущие объекту, и травматизма на нем</w:t>
       </w:r>
-      <w:bookmarkEnd w:id="43"/>
+      <w:bookmarkEnd w:id="44"/>
     </w:p>
     <w:p>
       <w:pPr>
@@ -8730,15 +8556,15 @@
           <w:lang w:eastAsia="en-US"/>
         </w:rPr>
       </w:pPr>
-      <w:bookmarkStart w:id="44" w:name="_Toc405384919"/>
-      <w:bookmarkStart w:id="45" w:name="_Toc405989862"/>
-      <w:bookmarkStart w:id="46" w:name="_Toc409789862"/>
-      <w:bookmarkStart w:id="47" w:name="_Toc409790164"/>
-      <w:bookmarkStart w:id="48" w:name="_Toc427057243"/>
-      <w:bookmarkStart w:id="49" w:name="_Toc430943228"/>
-      <w:bookmarkStart w:id="50" w:name="_Toc430958121"/>
-      <w:bookmarkStart w:id="51" w:name="_Toc209703493"/>
-      <w:bookmarkStart w:id="52" w:name="_Toc221000966"/>
+      <w:bookmarkStart w:id="45" w:name="_Toc405384919"/>
+      <w:bookmarkStart w:id="46" w:name="_Toc405989862"/>
+      <w:bookmarkStart w:id="47" w:name="_Toc409789862"/>
+      <w:bookmarkStart w:id="48" w:name="_Toc409790164"/>
+      <w:bookmarkStart w:id="49" w:name="_Toc427057243"/>
+      <w:bookmarkStart w:id="50" w:name="_Toc430943228"/>
+      <w:bookmarkStart w:id="51" w:name="_Toc430958121"/>
+      <w:bookmarkStart w:id="52" w:name="_Toc209703493"/>
+      <w:bookmarkStart w:id="53" w:name="_Toc221000966"/>
       <w:r>
         <w:rPr>
           <w:lang w:eastAsia="en-US"/>
@@ -8800,7 +8626,6 @@
         </w:rPr>
         <w:t>соответствие задачам ликвидации последствий аварий</w:t>
       </w:r>
-      <w:bookmarkEnd w:id="44"/>
       <w:bookmarkEnd w:id="45"/>
       <w:bookmarkEnd w:id="46"/>
       <w:bookmarkEnd w:id="47"/>
@@ -8809,6 +8634,7 @@
       <w:bookmarkEnd w:id="50"/>
       <w:bookmarkEnd w:id="51"/>
       <w:bookmarkEnd w:id="52"/>
+      <w:bookmarkEnd w:id="53"/>
     </w:p>
     <w:p>
       <w:pPr>
@@ -8840,7 +8666,6 @@
           </w:placeholder>
           <w:text/>
         </w:sdtPr>
-        <w:sdtEndPr/>
         <w:sdtContent>
           <w:r>
             <w:t>${ASF_STATUS_SHORT}</w:t>
@@ -8862,7 +8687,6 @@
           </w:placeholder>
           <w:text/>
         </w:sdtPr>
-        <w:sdtEndPr/>
         <w:sdtContent>
           <w:r>
             <w:t>${ASF_FULL_NAME_GEN}</w:t>
@@ -8881,7 +8705,6 @@
           </w:placeholder>
           <w:text/>
         </w:sdtPr>
-        <w:sdtEndPr/>
         <w:sdtContent>
           <w:r>
             <w:t>${ASF_SHORT_NAME}</w:t>
@@ -8910,7 +8733,6 @@
           </w:placeholder>
           <w:text/>
         </w:sdtPr>
-        <w:sdtEndPr/>
         <w:sdtContent>
           <w:r>
             <w:rPr>
@@ -8956,7 +8778,6 @@
           </w:placeholder>
           <w:text/>
         </w:sdtPr>
-        <w:sdtEndPr/>
         <w:sdtContent>
           <w:r>
             <w:rPr>
@@ -8984,7 +8805,6 @@
           </w:placeholder>
           <w:text/>
         </w:sdtPr>
-        <w:sdtEndPr/>
         <w:sdtContent>
           <w:r>
             <w:t>${ASF_CERTIFICATE_TEXT}</w:t>
@@ -9013,7 +8833,6 @@
           </w:placeholder>
           <w:text/>
         </w:sdtPr>
-        <w:sdtEndPr/>
         <w:sdtContent>
           <w:r>
             <w:t>${ASF_WORK_TYPES}</w:t>
@@ -9048,7 +8867,7 @@
       <w:r>
         <w:t xml:space="preserve"> </w:t>
       </w:r>
-      <w:bookmarkStart w:id="53" w:name="_Hlk221181409"/>
+      <w:bookmarkStart w:id="54" w:name="_Hlk221181409"/>
       <w:sdt>
         <w:sdtPr>
           <w:tag w:val="ORG_SHORT_NAME"/>
@@ -9058,14 +8877,13 @@
           </w:placeholder>
           <w:text/>
         </w:sdtPr>
-        <w:sdtEndPr/>
         <w:sdtContent>
           <w:r>
             <w:t>${ORG_SHORT_NAME}</w:t>
           </w:r>
         </w:sdtContent>
       </w:sdt>
-      <w:bookmarkEnd w:id="53"/>
+      <w:bookmarkEnd w:id="54"/>
       <w:r>
         <w:t xml:space="preserve"> и </w:t>
       </w:r>
@@ -9078,7 +8896,6 @@
           </w:placeholder>
           <w:text/>
         </w:sdtPr>
-        <w:sdtEndPr/>
         <w:sdtContent>
           <w:r>
             <w:t>${ASF_SHORT_NAME}</w:t>
@@ -9121,7 +8938,6 @@
           </w:placeholder>
           <w:text/>
         </w:sdtPr>
-        <w:sdtEndPr/>
         <w:sdtContent>
           <w:r>
             <w:rPr>
@@ -9224,24 +9040,23 @@
       <w:pPr>
         <w:pStyle w:val="2a"/>
       </w:pPr>
-      <w:bookmarkStart w:id="54" w:name="_Toc430943229"/>
-      <w:bookmarkStart w:id="55" w:name="_Toc430958122"/>
-      <w:bookmarkStart w:id="56" w:name="_Toc209703494"/>
-      <w:bookmarkStart w:id="57" w:name="_Toc221000967"/>
+      <w:bookmarkStart w:id="55" w:name="_Toc430943229"/>
+      <w:bookmarkStart w:id="56" w:name="_Toc430958122"/>
+      <w:bookmarkStart w:id="57" w:name="_Toc209703494"/>
+      <w:bookmarkStart w:id="58" w:name="_Toc221000967"/>
       <w:r>
         <w:t>4.</w:t>
       </w:r>
       <w:r>
         <w:t xml:space="preserve"> </w:t>
       </w:r>
-      <w:bookmarkStart w:id="58" w:name="_Toc379906092"/>
-      <w:bookmarkStart w:id="59" w:name="_Toc381802538"/>
-      <w:bookmarkStart w:id="60" w:name="_Toc391383486"/>
-      <w:bookmarkStart w:id="61" w:name="_Toc414977738"/>
+      <w:bookmarkStart w:id="59" w:name="_Toc379906092"/>
+      <w:bookmarkStart w:id="60" w:name="_Toc381802538"/>
+      <w:bookmarkStart w:id="61" w:name="_Toc391383486"/>
+      <w:bookmarkStart w:id="62" w:name="_Toc414977738"/>
       <w:r>
         <w:t>Организация взаимодействия сил и средств</w:t>
       </w:r>
-      <w:bookmarkEnd w:id="54"/>
       <w:bookmarkEnd w:id="55"/>
       <w:bookmarkEnd w:id="56"/>
       <w:bookmarkEnd w:id="57"/>
@@ -9249,6 +9064,7 @@
       <w:bookmarkEnd w:id="59"/>
       <w:bookmarkEnd w:id="60"/>
       <w:bookmarkEnd w:id="61"/>
+      <w:bookmarkEnd w:id="62"/>
     </w:p>
     <w:p>
       <w:pPr>
@@ -9381,7 +9197,6 @@
           </w:placeholder>
           <w:text/>
         </w:sdtPr>
-        <w:sdtEndPr/>
         <w:sdtContent>
           <w:r>
             <w:t>${ORG_SHORT_NAME}</w:t>
@@ -9413,7 +9228,6 @@
           </w:placeholder>
           <w:text/>
         </w:sdtPr>
-        <w:sdtEndPr/>
         <w:sdtContent>
           <w:r>
             <w:rPr>
@@ -9441,7 +9255,6 @@
           </w:placeholder>
           <w:text/>
         </w:sdtPr>
-        <w:sdtEndPr/>
         <w:sdtContent>
           <w:r>
             <w:rPr>
@@ -9472,10 +9285,10 @@
       <w:pPr>
         <w:pStyle w:val="2a"/>
       </w:pPr>
-      <w:bookmarkStart w:id="62" w:name="_Toc430943230"/>
-      <w:bookmarkStart w:id="63" w:name="_Toc430958123"/>
-      <w:bookmarkStart w:id="64" w:name="_Toc209703495"/>
-      <w:bookmarkStart w:id="65" w:name="_Toc221000968"/>
+      <w:bookmarkStart w:id="63" w:name="_Toc430943230"/>
+      <w:bookmarkStart w:id="64" w:name="_Toc430958123"/>
+      <w:bookmarkStart w:id="65" w:name="_Toc209703495"/>
+      <w:bookmarkStart w:id="66" w:name="_Toc221000968"/>
       <w:r>
         <w:lastRenderedPageBreak/>
         <w:t>5</w:t>
@@ -9483,10 +9296,10 @@
       <w:r>
         <w:t>. Состав и дислокация сил и средств</w:t>
       </w:r>
-      <w:bookmarkEnd w:id="62"/>
       <w:bookmarkEnd w:id="63"/>
       <w:bookmarkEnd w:id="64"/>
       <w:bookmarkEnd w:id="65"/>
+      <w:bookmarkEnd w:id="66"/>
     </w:p>
     <w:p>
       <w:pPr>
@@ -9529,7 +9342,6 @@
           </w:placeholder>
           <w:text/>
         </w:sdtPr>
-        <w:sdtEndPr/>
         <w:sdtContent>
           <w:r>
             <w:t>${ORG_SHORT_NAME}</w:t>
@@ -9581,7 +9393,6 @@
           </w:placeholder>
           <w:text/>
         </w:sdtPr>
-        <w:sdtEndPr/>
         <w:sdtContent>
           <w:r>
             <w:rPr>
@@ -9633,7 +9444,6 @@
           </w:placeholder>
           <w:text/>
         </w:sdtPr>
-        <w:sdtEndPr/>
         <w:sdtContent>
           <w:r>
             <w:rPr>
@@ -9687,7 +9497,6 @@
           </w:placeholder>
           <w:text/>
         </w:sdtPr>
-        <w:sdtEndPr/>
         <w:sdtContent>
           <w:r>
             <w:rPr>
@@ -9715,7 +9524,6 @@
           </w:placeholder>
           <w:text/>
         </w:sdtPr>
-        <w:sdtEndPr/>
         <w:sdtContent>
           <w:r>
             <w:rPr>
@@ -9976,7 +9784,7 @@
         </w:rPr>
         <w:t>Привлекаемые силы и средства:</w:t>
       </w:r>
-      <w:bookmarkStart w:id="66" w:name="_Hlk221181612"/>
+      <w:bookmarkStart w:id="67" w:name="_Hlk221181612"/>
       <w:r>
         <w:t xml:space="preserve"> </w:t>
       </w:r>
@@ -9989,14 +9797,13 @@
           </w:placeholder>
           <w:text/>
         </w:sdtPr>
-        <w:sdtEndPr/>
         <w:sdtContent>
           <w:r>
             <w:t>${ASF_STATUS_SHORT}</w:t>
           </w:r>
         </w:sdtContent>
       </w:sdt>
-      <w:bookmarkEnd w:id="66"/>
+      <w:bookmarkEnd w:id="67"/>
       <w:r>
         <w:t xml:space="preserve"> –</w:t>
       </w:r>
@@ -10012,7 +9819,6 @@
           </w:placeholder>
           <w:text/>
         </w:sdtPr>
-        <w:sdtEndPr/>
         <w:sdtContent>
           <w:r>
             <w:t>${ASF_SHORT_NAME}</w:t>
@@ -10065,7 +9871,6 @@
           </w:placeholder>
           <w:text/>
         </w:sdtPr>
-        <w:sdtEndPr/>
         <w:sdtContent>
           <w:r>
             <w:t>${ASF_AREA_RESPONSIBILITY}</w:t>
@@ -10126,7 +9931,6 @@
           </w:placeholder>
           <w:text/>
         </w:sdtPr>
-        <w:sdtEndPr/>
         <w:sdtContent>
           <w:r>
             <w:rPr>
@@ -10181,7 +9985,6 @@
           </w:placeholder>
           <w:text/>
         </w:sdtPr>
-        <w:sdtEndPr/>
         <w:sdtContent>
           <w:r>
             <w:rPr>
@@ -10261,7 +10064,6 @@
           </w:placeholder>
           <w:text/>
         </w:sdtPr>
-        <w:sdtEndPr/>
         <w:sdtContent>
           <w:r>
             <w:rPr>
@@ -10322,7 +10124,6 @@
           </w:placeholder>
           <w:text/>
         </w:sdtPr>
-        <w:sdtEndPr/>
         <w:sdtContent>
           <w:r>
             <w:rPr>
@@ -10412,7 +10213,6 @@
           </w:placeholder>
           <w:text/>
         </w:sdtPr>
-        <w:sdtEndPr/>
         <w:sdtContent>
           <w:r>
             <w:rPr>
@@ -10476,7 +10276,6 @@
           </w:placeholder>
           <w:text/>
         </w:sdtPr>
-        <w:sdtEndPr/>
         <w:sdtContent>
           <w:r>
             <w:rPr>
@@ -10596,7 +10395,6 @@
           </w:placeholder>
           <w:text/>
         </w:sdtPr>
-        <w:sdtEndPr/>
         <w:sdtContent>
           <w:r>
             <w:rPr>
@@ -10676,7 +10474,6 @@
           </w:placeholder>
           <w:text/>
         </w:sdtPr>
-        <w:sdtEndPr/>
         <w:sdtContent>
           <w:r>
             <w:rPr>
@@ -10719,7 +10516,6 @@
         </w:placeholder>
         <w:text/>
       </w:sdtPr>
-      <w:sdtEndPr/>
       <w:sdtContent>
         <w:p>
           <w:pPr>
@@ -10794,7 +10590,6 @@
           </w:placeholder>
           <w:text/>
         </w:sdtPr>
-        <w:sdtEndPr/>
         <w:sdtContent>
           <w:r>
             <w:rPr>
@@ -10831,7 +10626,7 @@
       <w:r>
         <w:t xml:space="preserve"> </w:t>
       </w:r>
-      <w:bookmarkStart w:id="67" w:name="_Hlk221181717"/>
+      <w:bookmarkStart w:id="68" w:name="_Hlk221181717"/>
       <w:sdt>
         <w:sdtPr>
           <w:tag w:val="ASF_STATUS"/>
@@ -10841,7 +10636,6 @@
           </w:placeholder>
           <w:text/>
         </w:sdtPr>
-        <w:sdtEndPr/>
         <w:sdtContent>
           <w:r>
             <w:t>${ASF_STATUS_SHORT}</w:t>
@@ -10863,7 +10657,6 @@
           </w:placeholder>
           <w:text/>
         </w:sdtPr>
-        <w:sdtEndPr/>
         <w:sdtContent>
           <w:r>
             <w:t>${ASF_SHORT_NAME}</w:t>
@@ -10873,7 +10666,7 @@
       <w:r>
         <w:t xml:space="preserve"> </w:t>
       </w:r>
-      <w:bookmarkEnd w:id="67"/>
+      <w:bookmarkEnd w:id="68"/>
       <w:r>
         <w:t>приведены в Приложении 2.</w:t>
       </w:r>
@@ -10891,10 +10684,10 @@
           <w:lang w:eastAsia="en-US"/>
         </w:rPr>
       </w:pPr>
-      <w:bookmarkStart w:id="68" w:name="_Toc430943233"/>
-      <w:bookmarkStart w:id="69" w:name="_Toc430958125"/>
-      <w:bookmarkStart w:id="70" w:name="_Toc209703496"/>
-      <w:bookmarkStart w:id="71" w:name="_Toc221000969"/>
+      <w:bookmarkStart w:id="69" w:name="_Toc430943233"/>
+      <w:bookmarkStart w:id="70" w:name="_Toc430958125"/>
+      <w:bookmarkStart w:id="71" w:name="_Toc209703496"/>
+      <w:bookmarkStart w:id="72" w:name="_Toc221000969"/>
       <w:r>
         <w:rPr>
           <w:lang w:eastAsia="en-US"/>
@@ -10907,8 +10700,8 @@
         </w:rPr>
         <w:t xml:space="preserve">. Порядок обеспечения постоянной готовности сил и средств к локализации и ликвидации последствий аварий на </w:t>
       </w:r>
-      <w:bookmarkEnd w:id="68"/>
       <w:bookmarkEnd w:id="69"/>
+      <w:bookmarkEnd w:id="70"/>
       <w:r>
         <w:rPr>
           <w:lang w:eastAsia="en-US"/>
@@ -10921,8 +10714,8 @@
         </w:rPr>
         <w:t>, которые несут ответственность за поддержание этих сил и средств в надлежащей степени готовности</w:t>
       </w:r>
-      <w:bookmarkEnd w:id="70"/>
       <w:bookmarkEnd w:id="71"/>
+      <w:bookmarkEnd w:id="72"/>
     </w:p>
     <w:p>
       <w:pPr>
@@ -10945,7 +10738,6 @@
           </w:placeholder>
           <w:text/>
         </w:sdtPr>
-        <w:sdtEndPr/>
         <w:sdtContent>
           <w:r>
             <w:t>${ASF_STATUS_SHORT}</w:t>
@@ -10967,7 +10759,6 @@
           </w:placeholder>
           <w:text/>
         </w:sdtPr>
-        <w:sdtEndPr/>
         <w:sdtContent>
           <w:r>
             <w:t>${ASF_SHORT_NAME}</w:t>
@@ -11114,7 +10905,7 @@
       <w:r>
         <w:t xml:space="preserve"> </w:t>
       </w:r>
-      <w:bookmarkStart w:id="72" w:name="_Hlk221197015"/>
+      <w:bookmarkStart w:id="73" w:name="_Hlk221197015"/>
       <w:sdt>
         <w:sdtPr>
           <w:tag w:val="ASF_STATUS_SHORT"/>
@@ -11124,14 +10915,13 @@
           </w:placeholder>
           <w:text/>
         </w:sdtPr>
-        <w:sdtEndPr/>
         <w:sdtContent>
           <w:r>
             <w:t>${ASF_STATUS_SHORT}</w:t>
           </w:r>
         </w:sdtContent>
       </w:sdt>
-      <w:bookmarkEnd w:id="72"/>
+      <w:bookmarkEnd w:id="73"/>
       <w:r>
         <w:t xml:space="preserve"> </w:t>
       </w:r>
@@ -11147,7 +10937,6 @@
           </w:placeholder>
           <w:text/>
         </w:sdtPr>
-        <w:sdtEndPr/>
         <w:sdtContent>
           <w:r>
             <w:t>${ASF_SHORT_NAME}</w:t>
@@ -11246,23 +11035,23 @@
           <w:i/>
         </w:rPr>
       </w:pPr>
-      <w:bookmarkStart w:id="73" w:name="_Toc430943234"/>
-      <w:bookmarkStart w:id="74" w:name="_Toc430958126"/>
-      <w:bookmarkStart w:id="75" w:name="_Toc209703497"/>
-      <w:bookmarkStart w:id="76" w:name="_Toc221000970"/>
+      <w:bookmarkStart w:id="74" w:name="_Toc430943234"/>
+      <w:bookmarkStart w:id="75" w:name="_Toc430958126"/>
+      <w:bookmarkStart w:id="76" w:name="_Toc209703497"/>
+      <w:bookmarkStart w:id="77" w:name="_Toc221000970"/>
       <w:r>
         <w:t>7</w:t>
       </w:r>
       <w:r>
         <w:t xml:space="preserve">. Организация управления, связи и оповещения при аварии на </w:t>
       </w:r>
-      <w:bookmarkEnd w:id="73"/>
       <w:bookmarkEnd w:id="74"/>
       <w:bookmarkEnd w:id="75"/>
+      <w:bookmarkEnd w:id="76"/>
       <w:r>
         <w:t>объекте</w:t>
       </w:r>
-      <w:bookmarkEnd w:id="76"/>
+      <w:bookmarkEnd w:id="77"/>
     </w:p>
     <w:p>
       <w:pPr>
@@ -11282,7 +11071,6 @@
           </w:placeholder>
           <w:text/>
         </w:sdtPr>
-        <w:sdtEndPr/>
         <w:sdtContent>
           <w:r>
             <w:t>${ORG_SHORT_NAME}</w:t>
@@ -11357,7 +11145,6 @@
           </w:placeholder>
           <w:text/>
         </w:sdtPr>
-        <w:sdtEndPr/>
         <w:sdtContent>
           <w:r>
             <w:t>${ORG_SHORT_NAME}</w:t>
@@ -11469,7 +11256,6 @@
           </w:placeholder>
           <w:text/>
         </w:sdtPr>
-        <w:sdtEndPr/>
         <w:sdtContent>
           <w:r>
             <w:rPr>
@@ -11497,7 +11283,6 @@
           </w:placeholder>
           <w:text/>
         </w:sdtPr>
-        <w:sdtEndPr/>
         <w:sdtContent>
           <w:r>
             <w:rPr>
@@ -11545,7 +11330,6 @@
           </w:placeholder>
           <w:text/>
         </w:sdtPr>
-        <w:sdtEndPr/>
         <w:sdtContent>
           <w:r>
             <w:rPr>
@@ -11573,7 +11357,6 @@
           </w:placeholder>
           <w:text/>
         </w:sdtPr>
-        <w:sdtEndPr/>
         <w:sdtContent>
           <w:r>
             <w:rPr>
@@ -11611,7 +11394,6 @@
           </w:placeholder>
           <w:text/>
         </w:sdtPr>
-        <w:sdtEndPr/>
         <w:sdtContent>
           <w:r>
             <w:rPr>
@@ -11663,7 +11445,6 @@
           </w:placeholder>
           <w:text/>
         </w:sdtPr>
-        <w:sdtEndPr/>
         <w:sdtContent>
           <w:r>
             <w:rPr>
@@ -11714,7 +11495,6 @@
           </w:placeholder>
           <w:text/>
         </w:sdtPr>
-        <w:sdtEndPr/>
         <w:sdtContent>
           <w:r>
             <w:rPr>
@@ -11766,7 +11546,6 @@
           </w:placeholder>
           <w:text/>
         </w:sdtPr>
-        <w:sdtEndPr/>
         <w:sdtContent>
           <w:r>
             <w:rPr>
@@ -11816,7 +11595,6 @@
           </w:placeholder>
           <w:text/>
         </w:sdtPr>
-        <w:sdtEndPr/>
         <w:sdtContent>
           <w:r>
             <w:rPr>
@@ -11844,7 +11622,6 @@
           </w:placeholder>
           <w:text/>
         </w:sdtPr>
-        <w:sdtEndPr/>
         <w:sdtContent>
           <w:r>
             <w:rPr>
@@ -11899,7 +11676,6 @@
           </w:placeholder>
           <w:text/>
         </w:sdtPr>
-        <w:sdtEndPr/>
         <w:sdtContent>
           <w:r>
             <w:rPr>
@@ -11927,7 +11703,6 @@
           </w:placeholder>
           <w:text/>
         </w:sdtPr>
-        <w:sdtEndPr/>
         <w:sdtContent>
           <w:r>
             <w:rPr>
@@ -12194,7 +11969,6 @@
           </w:placeholder>
           <w:text/>
         </w:sdtPr>
-        <w:sdtEndPr/>
         <w:sdtContent>
           <w:r>
             <w:rPr>
@@ -12222,7 +11996,6 @@
           </w:placeholder>
           <w:text/>
         </w:sdtPr>
-        <w:sdtEndPr/>
         <w:sdtContent>
           <w:r>
             <w:rPr>
@@ -12429,7 +12202,6 @@
           </w:placeholder>
           <w:text/>
         </w:sdtPr>
-        <w:sdtEndPr/>
         <w:sdtContent>
           <w:r>
             <w:rPr>
@@ -12463,7 +12235,6 @@
           </w:placeholder>
           <w:text/>
         </w:sdtPr>
-        <w:sdtEndPr/>
         <w:sdtContent>
           <w:r>
             <w:rPr>
@@ -12791,9 +12562,6 @@
       </w:r>
       <w:sdt>
         <w:sdtPr>
-          <w:rPr>
-            <w:lang w:val="en-US"/>
-          </w:rPr>
           <w:tag w:val="OBJ_NUM_4_IMAGE"/>
           <w:id w:val="291799473"/>
           <w:placeholder>
@@ -12801,27 +12569,17 @@
           </w:placeholder>
           <w:text/>
         </w:sdtPr>
-        <w:sdtEndPr/>
         <w:sdtContent>
           <w:r>
-            <w:rPr>
-              <w:lang w:val="en-US"/>
-            </w:rPr>
             <w:t>${OBJ_NUM_4_IMAGE}</w:t>
           </w:r>
         </w:sdtContent>
       </w:sdt>
       <w:r>
-        <w:rPr>
-          <w:lang w:val="en-US"/>
-        </w:rPr>
         <w:t xml:space="preserve"> – </w:t>
       </w:r>
       <w:sdt>
         <w:sdtPr>
-          <w:rPr>
-            <w:lang w:val="en-US"/>
-          </w:rPr>
           <w:tag w:val="OBJ_TEXT_CAPTURE_4_IMAGE"/>
           <w:id w:val="-819424790"/>
           <w:placeholder>
@@ -12829,20 +12587,13 @@
           </w:placeholder>
           <w:text/>
         </w:sdtPr>
-        <w:sdtEndPr/>
         <w:sdtContent>
           <w:r>
-            <w:rPr>
-              <w:lang w:val="en-US"/>
-            </w:rPr>
             <w:t>${OBJ_TEXT_CAPTURE_4_IMAGE}</w:t>
           </w:r>
         </w:sdtContent>
       </w:sdt>
       <w:r>
-        <w:rPr>
-          <w:lang w:val="en-US"/>
-        </w:rPr>
         <w:t>.</w:t>
       </w:r>
     </w:p>
@@ -12853,11 +12604,11 @@
           <w:lang w:eastAsia="en-US"/>
         </w:rPr>
       </w:pPr>
-      <w:bookmarkStart w:id="77" w:name="_Toc427057250"/>
-      <w:bookmarkStart w:id="78" w:name="_Toc430943235"/>
-      <w:bookmarkStart w:id="79" w:name="_Toc430958127"/>
-      <w:bookmarkStart w:id="80" w:name="_Toc209703498"/>
-      <w:bookmarkStart w:id="81" w:name="_Toc221000971"/>
+      <w:bookmarkStart w:id="78" w:name="_Toc427057250"/>
+      <w:bookmarkStart w:id="79" w:name="_Toc430943235"/>
+      <w:bookmarkStart w:id="80" w:name="_Toc430958127"/>
+      <w:bookmarkStart w:id="81" w:name="_Toc209703498"/>
+      <w:bookmarkStart w:id="82" w:name="_Toc221000971"/>
       <w:r>
         <w:rPr>
           <w:lang w:eastAsia="en-US"/>
@@ -12871,11 +12622,11 @@
         </w:rPr>
         <w:t>. Система взаимного обмена информацией между организациями – участниками локализации и ликвидации последствий аварий на объекте</w:t>
       </w:r>
-      <w:bookmarkEnd w:id="77"/>
       <w:bookmarkEnd w:id="78"/>
       <w:bookmarkEnd w:id="79"/>
       <w:bookmarkEnd w:id="80"/>
       <w:bookmarkEnd w:id="81"/>
+      <w:bookmarkEnd w:id="82"/>
     </w:p>
     <w:p>
       <w:pPr>
@@ -12946,12 +12697,12 @@
           <w:lang w:eastAsia="en-US"/>
         </w:rPr>
       </w:pPr>
-      <w:bookmarkStart w:id="82" w:name="_Toc394928129"/>
-      <w:bookmarkStart w:id="83" w:name="_Toc427057251"/>
-      <w:bookmarkStart w:id="84" w:name="_Toc430943236"/>
-      <w:bookmarkStart w:id="85" w:name="_Toc430958128"/>
-      <w:bookmarkStart w:id="86" w:name="_Toc209703499"/>
-      <w:bookmarkStart w:id="87" w:name="_Toc221000972"/>
+      <w:bookmarkStart w:id="83" w:name="_Toc394928129"/>
+      <w:bookmarkStart w:id="84" w:name="_Toc427057251"/>
+      <w:bookmarkStart w:id="85" w:name="_Toc430943236"/>
+      <w:bookmarkStart w:id="86" w:name="_Toc430958128"/>
+      <w:bookmarkStart w:id="87" w:name="_Toc209703499"/>
+      <w:bookmarkStart w:id="88" w:name="_Toc221000972"/>
       <w:r>
         <w:rPr>
           <w:lang w:eastAsia="en-US"/>
@@ -12964,12 +12715,12 @@
         </w:rPr>
         <w:t>. Первоочередные действия при получении сигнала об аварии на объекте</w:t>
       </w:r>
-      <w:bookmarkEnd w:id="82"/>
       <w:bookmarkEnd w:id="83"/>
       <w:bookmarkEnd w:id="84"/>
       <w:bookmarkEnd w:id="85"/>
       <w:bookmarkEnd w:id="86"/>
       <w:bookmarkEnd w:id="87"/>
+      <w:bookmarkEnd w:id="88"/>
     </w:p>
     <w:p>
       <w:pPr>
@@ -13085,25 +12836,25 @@
           <w:szCs w:val="24"/>
         </w:rPr>
       </w:pPr>
-      <w:bookmarkStart w:id="88" w:name="_Toc430943237"/>
-      <w:bookmarkStart w:id="89" w:name="_Toc430958129"/>
+      <w:bookmarkStart w:id="89" w:name="_Toc430943237"/>
+      <w:bookmarkStart w:id="90" w:name="_Toc430958129"/>
     </w:p>
     <w:p>
       <w:pPr>
         <w:pStyle w:val="2a"/>
       </w:pPr>
-      <w:bookmarkStart w:id="90" w:name="_Toc209703500"/>
-      <w:bookmarkStart w:id="91" w:name="_Toc221000973"/>
+      <w:bookmarkStart w:id="91" w:name="_Toc209703500"/>
+      <w:bookmarkStart w:id="92" w:name="_Toc221000973"/>
       <w:r>
         <w:t>10</w:t>
       </w:r>
       <w:r>
         <w:t>. Действия производственного персонала и аварийно-спасательных служб (формирований) по локализации и ликвидации аварийных ситуаций на ОПО</w:t>
       </w:r>
-      <w:bookmarkEnd w:id="88"/>
       <w:bookmarkEnd w:id="89"/>
       <w:bookmarkEnd w:id="90"/>
       <w:bookmarkEnd w:id="91"/>
+      <w:bookmarkEnd w:id="92"/>
     </w:p>
     <w:p>
       <w:pPr>
@@ -13129,7 +12880,6 @@
           </w:placeholder>
           <w:text/>
         </w:sdtPr>
-        <w:sdtEndPr/>
         <w:sdtContent>
           <w:r>
             <w:t>${OBJ_LINC_TEXT_9_TABLE}</w:t>
@@ -13148,7 +12898,6 @@
           </w:placeholder>
           <w:text/>
         </w:sdtPr>
-        <w:sdtEndPr/>
         <w:sdtContent>
           <w:r>
             <w:t>${OBJ_NUM_9_TABLE}</w:t>
@@ -13170,16 +12919,16 @@
       <w:pPr>
         <w:pStyle w:val="2a"/>
       </w:pPr>
-      <w:bookmarkStart w:id="92" w:name="_Toc209703501"/>
-      <w:bookmarkStart w:id="93" w:name="_Toc221000974"/>
+      <w:bookmarkStart w:id="93" w:name="_Toc209703501"/>
+      <w:bookmarkStart w:id="94" w:name="_Toc221000974"/>
       <w:r>
         <w:t>11</w:t>
       </w:r>
       <w:r>
         <w:t>. Мероприятия, направленные на обеспечение безопасности населения</w:t>
       </w:r>
-      <w:bookmarkEnd w:id="92"/>
       <w:bookmarkEnd w:id="93"/>
+      <w:bookmarkEnd w:id="94"/>
     </w:p>
     <w:p>
       <w:pPr>
@@ -13846,8 +13595,8 @@
       <w:pPr>
         <w:pStyle w:val="2a"/>
       </w:pPr>
-      <w:bookmarkStart w:id="94" w:name="_Toc209703502"/>
-      <w:bookmarkStart w:id="95" w:name="_Toc221000975"/>
+      <w:bookmarkStart w:id="95" w:name="_Toc209703502"/>
+      <w:bookmarkStart w:id="96" w:name="_Toc221000975"/>
       <w:r>
         <w:t>1</w:t>
       </w:r>
@@ -13857,8 +13606,8 @@
       <w:r>
         <w:t>. Организация материально-технического, инженерного и финансового обеспечения операций по локализации и ликвидации аварий на объекте</w:t>
       </w:r>
-      <w:bookmarkEnd w:id="94"/>
       <w:bookmarkEnd w:id="95"/>
+      <w:bookmarkEnd w:id="96"/>
     </w:p>
     <w:p>
       <w:pPr>
@@ -13887,7 +13636,6 @@
           </w:placeholder>
           <w:text/>
         </w:sdtPr>
-        <w:sdtEndPr/>
         <w:sdtContent>
           <w:r>
             <w:t>${OBJ_ORDER_MINIMUM_BALANCE_NUMBER}</w:t>
@@ -13906,7 +13654,6 @@
           </w:placeholder>
           <w:text/>
         </w:sdtPr>
-        <w:sdtEndPr/>
         <w:sdtContent>
           <w:r>
             <w:t>${OBJ_ORDER_MINIMUM_BALANCE_DATE}</w:t>
@@ -14022,7 +13769,6 @@
           </w:placeholder>
           <w:text/>
         </w:sdtPr>
-        <w:sdtEndPr/>
         <w:sdtContent>
           <w:r>
             <w:t>${OBJ_INSURANCE_POLICY_NUMBER}</w:t>
@@ -14050,7 +13796,6 @@
           </w:placeholder>
           <w:text/>
         </w:sdtPr>
-        <w:sdtEndPr/>
         <w:sdtContent>
           <w:r>
             <w:t>${OBJ_INSURANCE_POLICY_DATE}</w:t>
@@ -14068,20 +13813,20 @@
       <w:pPr>
         <w:pStyle w:val="1"/>
       </w:pPr>
-      <w:bookmarkStart w:id="96" w:name="_Toc394651834"/>
-      <w:bookmarkStart w:id="97" w:name="_Toc430097612"/>
-      <w:bookmarkStart w:id="98" w:name="_Toc430255939"/>
-      <w:bookmarkStart w:id="99" w:name="_Toc209703503"/>
-      <w:bookmarkStart w:id="100" w:name="_Toc221000976"/>
+      <w:bookmarkStart w:id="97" w:name="_Toc394651834"/>
+      <w:bookmarkStart w:id="98" w:name="_Toc430097612"/>
+      <w:bookmarkStart w:id="99" w:name="_Toc430255939"/>
+      <w:bookmarkStart w:id="100" w:name="_Toc209703503"/>
+      <w:bookmarkStart w:id="101" w:name="_Toc221000976"/>
       <w:r>
         <w:lastRenderedPageBreak/>
         <w:t>Специальные разделы плана мероприятий</w:t>
       </w:r>
-      <w:bookmarkEnd w:id="96"/>
       <w:bookmarkEnd w:id="97"/>
       <w:bookmarkEnd w:id="98"/>
       <w:bookmarkEnd w:id="99"/>
       <w:bookmarkEnd w:id="100"/>
+      <w:bookmarkEnd w:id="101"/>
     </w:p>
     <w:p>
       <w:pPr>
@@ -14103,7 +13848,6 @@
           </w:placeholder>
           <w:text/>
         </w:sdtPr>
-        <w:sdtEndPr/>
         <w:sdtContent>
           <w:r>
             <w:t>${OBJ_NUM_9_TABLE}</w:t>
@@ -14122,7 +13866,6 @@
           </w:placeholder>
           <w:text/>
         </w:sdtPr>
-        <w:sdtEndPr/>
         <w:sdtContent>
           <w:r>
             <w:t>${OBJ_TEXT_NAME_9_TABLE}</w:t>
@@ -14628,7 +14371,6 @@
                 </w:placeholder>
                 <w:text/>
               </w:sdtPr>
-              <w:sdtEndPr/>
               <w:sdtContent>
                 <w:r>
                   <w:rPr>
@@ -14656,7 +14398,6 @@
                 </w:placeholder>
                 <w:text/>
               </w:sdtPr>
-              <w:sdtEndPr/>
               <w:sdtContent>
                 <w:r>
                   <w:rPr>
@@ -14684,7 +14425,6 @@
                 </w:placeholder>
                 <w:text/>
               </w:sdtPr>
-              <w:sdtEndPr/>
               <w:sdtContent>
                 <w:r>
                   <w:rPr>
@@ -14844,7 +14584,6 @@
                 </w:placeholder>
                 <w:text/>
               </w:sdtPr>
-              <w:sdtEndPr/>
               <w:sdtContent>
                 <w:r>
                   <w:t>${ASF_STATUS_SHORT}</w:t>
@@ -14863,7 +14602,6 @@
                 </w:placeholder>
                 <w:text/>
               </w:sdtPr>
-              <w:sdtEndPr/>
               <w:sdtContent>
                 <w:r>
                   <w:t>${ASF_SHORT_NAME}</w:t>
@@ -14885,7 +14623,6 @@
                 </w:placeholder>
                 <w:text/>
               </w:sdtPr>
-              <w:sdtEndPr/>
               <w:sdtContent>
                 <w:r>
                   <w:t>${ASF_ARRIVAL_TIME}</w:t>
@@ -15352,7 +15089,6 @@
                 </w:placeholder>
                 <w:text/>
               </w:sdtPr>
-              <w:sdtEndPr/>
               <w:sdtContent>
                 <w:r>
                   <w:rPr>
@@ -15380,7 +15116,6 @@
                 </w:placeholder>
                 <w:text/>
               </w:sdtPr>
-              <w:sdtEndPr/>
               <w:sdtContent>
                 <w:r>
                   <w:rPr>
@@ -15408,7 +15143,6 @@
                 </w:placeholder>
                 <w:text/>
               </w:sdtPr>
-              <w:sdtEndPr/>
               <w:sdtContent>
                 <w:r>
                   <w:rPr>
@@ -15587,7 +15321,6 @@
                 </w:placeholder>
                 <w:text/>
               </w:sdtPr>
-              <w:sdtEndPr/>
               <w:sdtContent>
                 <w:r>
                   <w:t>${ASF_STATUS_SHORT}</w:t>
@@ -15606,7 +15339,6 @@
                 </w:placeholder>
                 <w:text/>
               </w:sdtPr>
-              <w:sdtEndPr/>
               <w:sdtContent>
                 <w:r>
                   <w:t>${ASF_SHORT_NAME}</w:t>
@@ -15628,7 +15360,6 @@
                 </w:placeholder>
                 <w:text/>
               </w:sdtPr>
-              <w:sdtEndPr/>
               <w:sdtContent>
                 <w:r>
                   <w:t>${ASF_ARRIVAL_TIME}</w:t>
@@ -16298,7 +16029,6 @@
                 </w:placeholder>
                 <w:text/>
               </w:sdtPr>
-              <w:sdtEndPr/>
               <w:sdtContent>
                 <w:r>
                   <w:rPr>
@@ -16326,7 +16056,6 @@
                 </w:placeholder>
                 <w:text/>
               </w:sdtPr>
-              <w:sdtEndPr/>
               <w:sdtContent>
                 <w:r>
                   <w:rPr>
@@ -16805,14 +16534,14 @@
           <w:lang w:eastAsia="en-US"/>
         </w:rPr>
       </w:pPr>
-      <w:bookmarkStart w:id="101" w:name="_Toc414022297"/>
-      <w:bookmarkStart w:id="102" w:name="_Toc427057254"/>
-      <w:bookmarkStart w:id="103" w:name="_Toc431390633"/>
-      <w:bookmarkStart w:id="104" w:name="_Toc209703504"/>
-      <w:bookmarkStart w:id="105" w:name="_Toc221000977"/>
-      <w:bookmarkStart w:id="106" w:name="_Toc427057264"/>
-      <w:bookmarkStart w:id="107" w:name="_Toc430943242"/>
-      <w:bookmarkStart w:id="108" w:name="_Toc430958131"/>
+      <w:bookmarkStart w:id="102" w:name="_Toc414022297"/>
+      <w:bookmarkStart w:id="103" w:name="_Toc427057254"/>
+      <w:bookmarkStart w:id="104" w:name="_Toc431390633"/>
+      <w:bookmarkStart w:id="105" w:name="_Toc209703504"/>
+      <w:bookmarkStart w:id="106" w:name="_Toc221000977"/>
+      <w:bookmarkStart w:id="107" w:name="_Toc427057264"/>
+      <w:bookmarkStart w:id="108" w:name="_Toc430943242"/>
+      <w:bookmarkStart w:id="109" w:name="_Toc430958131"/>
       <w:r>
         <w:rPr>
           <w:lang w:eastAsia="en-US"/>
@@ -16826,11 +16555,11 @@
         </w:rPr>
         <w:t>. Распределение обязанностей между отдельными лицами, участвующими в ликвидации аварии</w:t>
       </w:r>
-      <w:bookmarkEnd w:id="101"/>
       <w:bookmarkEnd w:id="102"/>
       <w:bookmarkEnd w:id="103"/>
       <w:bookmarkEnd w:id="104"/>
       <w:bookmarkEnd w:id="105"/>
+      <w:bookmarkEnd w:id="106"/>
     </w:p>
     <w:p>
       <w:pPr>
@@ -16844,16 +16573,16 @@
       <w:pPr>
         <w:pStyle w:val="2a"/>
       </w:pPr>
-      <w:bookmarkStart w:id="109" w:name="_Toc209703505"/>
-      <w:bookmarkStart w:id="110" w:name="_Toc221000978"/>
+      <w:bookmarkStart w:id="110" w:name="_Toc209703505"/>
+      <w:bookmarkStart w:id="111" w:name="_Toc221000978"/>
       <w:r>
         <w:t>13.</w:t>
       </w:r>
       <w:r>
         <w:t>1. Общие положения</w:t>
       </w:r>
-      <w:bookmarkEnd w:id="109"/>
       <w:bookmarkEnd w:id="110"/>
+      <w:bookmarkEnd w:id="111"/>
     </w:p>
     <w:p>
       <w:pPr>
@@ -17219,7 +16948,6 @@
           </w:placeholder>
           <w:text/>
         </w:sdtPr>
-        <w:sdtEndPr/>
         <w:sdtContent>
           <w:r>
             <w:rPr>
@@ -17274,7 +17002,6 @@
           </w:placeholder>
           <w:text/>
         </w:sdtPr>
-        <w:sdtEndPr/>
         <w:sdtContent>
           <w:r>
             <w:rPr>
@@ -17361,7 +17088,6 @@
           </w:placeholder>
           <w:text/>
         </w:sdtPr>
-        <w:sdtEndPr/>
         <w:sdtContent>
           <w:r>
             <w:rPr>
@@ -17398,8 +17124,8 @@
       <w:pPr>
         <w:pStyle w:val="2a"/>
       </w:pPr>
-      <w:bookmarkStart w:id="111" w:name="_Toc209703506"/>
-      <w:bookmarkStart w:id="112" w:name="_Toc221000979"/>
+      <w:bookmarkStart w:id="112" w:name="_Toc209703506"/>
+      <w:bookmarkStart w:id="113" w:name="_Toc221000979"/>
       <w:r>
         <w:t>13.</w:t>
       </w:r>
@@ -17412,8 +17138,8 @@
       <w:r>
         <w:t xml:space="preserve"> руководителем выполняется следующий комплекс мер:</w:t>
       </w:r>
-      <w:bookmarkEnd w:id="111"/>
       <w:bookmarkEnd w:id="112"/>
+      <w:bookmarkEnd w:id="113"/>
     </w:p>
     <w:p>
       <w:pPr>
@@ -17832,16 +17558,16 @@
       <w:pPr>
         <w:pStyle w:val="2a"/>
       </w:pPr>
-      <w:bookmarkStart w:id="113" w:name="_Toc209703507"/>
-      <w:bookmarkStart w:id="114" w:name="_Toc221000980"/>
+      <w:bookmarkStart w:id="114" w:name="_Toc209703507"/>
+      <w:bookmarkStart w:id="115" w:name="_Toc221000980"/>
       <w:r>
         <w:t>13.</w:t>
       </w:r>
       <w:r>
         <w:t>3. Обязанности технического руководителя</w:t>
       </w:r>
-      <w:bookmarkEnd w:id="113"/>
       <w:bookmarkEnd w:id="114"/>
+      <w:bookmarkEnd w:id="115"/>
     </w:p>
     <w:p>
       <w:pPr>
@@ -18250,8 +17976,8 @@
       <w:pPr>
         <w:pStyle w:val="2a"/>
       </w:pPr>
-      <w:bookmarkStart w:id="115" w:name="_Toc209703508"/>
-      <w:bookmarkStart w:id="116" w:name="_Toc221000981"/>
+      <w:bookmarkStart w:id="116" w:name="_Toc209703508"/>
+      <w:bookmarkStart w:id="117" w:name="_Toc221000981"/>
       <w:r>
         <w:t>13.4.</w:t>
       </w:r>
@@ -18264,8 +17990,8 @@
       <w:r>
         <w:t xml:space="preserve"> </w:t>
       </w:r>
-      <w:bookmarkStart w:id="117" w:name="_Hlk221183206"/>
-      <w:bookmarkEnd w:id="115"/>
+      <w:bookmarkStart w:id="118" w:name="_Hlk221183206"/>
+      <w:bookmarkEnd w:id="116"/>
       <w:sdt>
         <w:sdtPr>
           <w:rPr>
@@ -18278,7 +18004,6 @@
           </w:placeholder>
           <w:text/>
         </w:sdtPr>
-        <w:sdtEndPr/>
         <w:sdtContent>
           <w:r>
             <w:rPr>
@@ -18288,8 +18013,8 @@
           </w:r>
         </w:sdtContent>
       </w:sdt>
-      <w:bookmarkEnd w:id="116"/>
       <w:bookmarkEnd w:id="117"/>
+      <w:bookmarkEnd w:id="118"/>
     </w:p>
     <w:p>
       <w:pPr>
@@ -18436,7 +18161,6 @@
           </w:placeholder>
           <w:text/>
         </w:sdtPr>
-        <w:sdtEndPr/>
         <w:sdtContent>
           <w:r>
             <w:rPr>
@@ -18706,8 +18430,8 @@
       <w:pPr>
         <w:pStyle w:val="2a"/>
       </w:pPr>
-      <w:bookmarkStart w:id="118" w:name="_Toc209703509"/>
-      <w:bookmarkStart w:id="119" w:name="_Toc221000982"/>
+      <w:bookmarkStart w:id="119" w:name="_Toc209703509"/>
+      <w:bookmarkStart w:id="120" w:name="_Toc221000982"/>
       <w:r>
         <w:t>13.</w:t>
       </w:r>
@@ -18717,8 +18441,8 @@
       <w:r>
         <w:t>начальника участка</w:t>
       </w:r>
-      <w:bookmarkEnd w:id="118"/>
       <w:bookmarkEnd w:id="119"/>
+      <w:bookmarkEnd w:id="120"/>
     </w:p>
     <w:p>
       <w:pPr>
@@ -18992,8 +18716,8 @@
       <w:pPr>
         <w:pStyle w:val="2a"/>
       </w:pPr>
-      <w:bookmarkStart w:id="120" w:name="_Toc209703510"/>
-      <w:bookmarkStart w:id="121" w:name="_Toc221000983"/>
+      <w:bookmarkStart w:id="121" w:name="_Toc209703510"/>
+      <w:bookmarkStart w:id="122" w:name="_Toc221000983"/>
       <w:r>
         <w:t>13.</w:t>
       </w:r>
@@ -19003,11 +18727,11 @@
       <w:r>
         <w:t xml:space="preserve"> </w:t>
       </w:r>
-      <w:bookmarkEnd w:id="120"/>
+      <w:bookmarkEnd w:id="121"/>
       <w:r>
         <w:t>Объекта</w:t>
       </w:r>
-      <w:bookmarkEnd w:id="121"/>
+      <w:bookmarkEnd w:id="122"/>
     </w:p>
     <w:p>
       <w:pPr>
@@ -19083,7 +18807,6 @@
           </w:placeholder>
           <w:text/>
         </w:sdtPr>
-        <w:sdtEndPr/>
         <w:sdtContent>
           <w:r>
             <w:rPr>
@@ -19208,15 +18931,15 @@
       <w:pPr>
         <w:pStyle w:val="2a"/>
       </w:pPr>
-      <w:bookmarkStart w:id="122" w:name="_Toc209703511"/>
-      <w:bookmarkStart w:id="123" w:name="_Toc221000984"/>
+      <w:bookmarkStart w:id="123" w:name="_Toc209703511"/>
+      <w:bookmarkStart w:id="124" w:name="_Toc221000984"/>
       <w:r>
         <w:t>13.</w:t>
       </w:r>
       <w:r>
         <w:t xml:space="preserve">7. Обязанности членов </w:t>
       </w:r>
-      <w:bookmarkStart w:id="124" w:name="_Hlk221183488"/>
+      <w:bookmarkStart w:id="125" w:name="_Hlk221183488"/>
       <w:sdt>
         <w:sdtPr>
           <w:tag w:val="ASF_STATUS_SHORT"/>
@@ -19226,14 +18949,13 @@
           </w:placeholder>
           <w:text/>
         </w:sdtPr>
-        <w:sdtEndPr/>
         <w:sdtContent>
           <w:r>
             <w:t>${ASF_STATUS_SHORT}</w:t>
           </w:r>
         </w:sdtContent>
       </w:sdt>
-      <w:bookmarkEnd w:id="124"/>
+      <w:bookmarkEnd w:id="125"/>
       <w:r>
         <w:t xml:space="preserve"> </w:t>
       </w:r>
@@ -19246,15 +18968,14 @@
           </w:placeholder>
           <w:text/>
         </w:sdtPr>
-        <w:sdtEndPr/>
         <w:sdtContent>
           <w:r>
             <w:t>${ASF_SHORT_NAME}</w:t>
           </w:r>
         </w:sdtContent>
       </w:sdt>
-      <w:bookmarkEnd w:id="122"/>
       <w:bookmarkEnd w:id="123"/>
+      <w:bookmarkEnd w:id="124"/>
     </w:p>
     <w:p>
       <w:pPr>
@@ -19685,16 +19406,16 @@
       <w:pPr>
         <w:pStyle w:val="2a"/>
       </w:pPr>
-      <w:bookmarkStart w:id="125" w:name="_Toc209703512"/>
-      <w:bookmarkStart w:id="126" w:name="_Toc221000985"/>
+      <w:bookmarkStart w:id="126" w:name="_Toc209703512"/>
+      <w:bookmarkStart w:id="127" w:name="_Toc221000985"/>
       <w:r>
         <w:t>13.</w:t>
       </w:r>
       <w:r>
         <w:t>8. Обязанности начальника ПЧ</w:t>
       </w:r>
-      <w:bookmarkEnd w:id="125"/>
       <w:bookmarkEnd w:id="126"/>
+      <w:bookmarkEnd w:id="127"/>
     </w:p>
     <w:p>
       <w:pPr>
@@ -19992,16 +19713,16 @@
       <w:pPr>
         <w:pStyle w:val="2a"/>
       </w:pPr>
-      <w:bookmarkStart w:id="127" w:name="_Toc209703513"/>
-      <w:bookmarkStart w:id="128" w:name="_Toc221000986"/>
+      <w:bookmarkStart w:id="128" w:name="_Toc209703513"/>
+      <w:bookmarkStart w:id="129" w:name="_Toc221000986"/>
       <w:r>
         <w:t>13.</w:t>
       </w:r>
       <w:r>
         <w:t>9. Обязанности медицинского врача</w:t>
       </w:r>
-      <w:bookmarkEnd w:id="127"/>
       <w:bookmarkEnd w:id="128"/>
+      <w:bookmarkEnd w:id="129"/>
     </w:p>
     <w:p>
       <w:pPr>
@@ -20047,16 +19768,16 @@
       <w:pPr>
         <w:pStyle w:val="2a"/>
       </w:pPr>
-      <w:bookmarkStart w:id="129" w:name="_Toc209703514"/>
-      <w:bookmarkStart w:id="130" w:name="_Toc221000987"/>
+      <w:bookmarkStart w:id="130" w:name="_Toc209703514"/>
+      <w:bookmarkStart w:id="131" w:name="_Toc221000987"/>
       <w:r>
         <w:t>13.10</w:t>
       </w:r>
       <w:r>
         <w:t>. Служба безопасности</w:t>
       </w:r>
-      <w:bookmarkEnd w:id="129"/>
       <w:bookmarkEnd w:id="130"/>
+      <w:bookmarkEnd w:id="131"/>
     </w:p>
     <w:p>
       <w:pPr>
@@ -20094,16 +19815,16 @@
         <w:pStyle w:val="1"/>
         <w:jc w:val="left"/>
       </w:pPr>
-      <w:bookmarkStart w:id="131" w:name="_Toc381802546"/>
-      <w:bookmarkStart w:id="132" w:name="_Toc391383493"/>
-      <w:bookmarkStart w:id="133" w:name="_Toc414977744"/>
-      <w:bookmarkStart w:id="134" w:name="_Toc430943246"/>
-      <w:bookmarkStart w:id="135" w:name="_Toc433207695"/>
-      <w:bookmarkStart w:id="136" w:name="_Toc209703515"/>
-      <w:bookmarkStart w:id="137" w:name="_Toc221000988"/>
-      <w:bookmarkEnd w:id="106"/>
+      <w:bookmarkStart w:id="132" w:name="_Toc433207695"/>
+      <w:bookmarkStart w:id="133" w:name="_Toc209703515"/>
+      <w:bookmarkStart w:id="134" w:name="_Toc221000988"/>
+      <w:bookmarkStart w:id="135" w:name="_Toc381802546"/>
+      <w:bookmarkStart w:id="136" w:name="_Toc391383493"/>
+      <w:bookmarkStart w:id="137" w:name="_Toc414977744"/>
+      <w:bookmarkStart w:id="138" w:name="_Toc430943246"/>
       <w:bookmarkEnd w:id="107"/>
       <w:bookmarkEnd w:id="108"/>
+      <w:bookmarkEnd w:id="109"/>
       <w:r>
         <w:lastRenderedPageBreak/>
         <w:t xml:space="preserve">ПРИЛОЖЕНИЕ 1. Свидетельство на право ведения аварийно-спасательных работ в чрезвычайных ситуациях </w:t>
@@ -20117,7 +19838,6 @@
           </w:placeholder>
           <w:text/>
         </w:sdtPr>
-        <w:sdtEndPr/>
         <w:sdtContent>
           <w:r>
             <w:t>${ASF_STATUS_SHORT}</w:t>
@@ -20127,7 +19847,7 @@
       <w:r>
         <w:t xml:space="preserve"> </w:t>
       </w:r>
-      <w:bookmarkEnd w:id="135"/>
+      <w:bookmarkEnd w:id="132"/>
       <w:sdt>
         <w:sdtPr>
           <w:tag w:val="ASF_SHORT_NAME"/>
@@ -20137,54 +19857,92 @@
           </w:placeholder>
           <w:text/>
         </w:sdtPr>
-        <w:sdtEndPr/>
         <w:sdtContent>
           <w:r>
             <w:t>${ASF_SHORT_NAME}</w:t>
           </w:r>
         </w:sdtContent>
       </w:sdt>
+      <w:bookmarkEnd w:id="133"/>
+      <w:bookmarkEnd w:id="134"/>
+    </w:p>
+    <w:p>
+      <w:pPr>
+        <w:jc w:val="center"/>
+        <w:rPr>
+          <w:lang w:val="en-US"/>
+        </w:rPr>
+      </w:pPr>
+      <w:r>
+        <w:rPr>
+          <w:lang w:val="en-US"/>
+        </w:rPr>
+        <w:t>ASF</w:t>
+      </w:r>
+      <w:r>
+        <w:rPr>
+          <w:lang w:val="en-US"/>
+        </w:rPr>
+        <w:t>_IMAGE_</w:t>
+      </w:r>
+      <w:r>
+        <w:rPr>
+          <w:lang w:val="en-US"/>
+        </w:rPr>
+        <w:t>1</w:t>
+      </w:r>
+      <w:r>
+        <w:rPr>
+          <w:lang w:val="en-US"/>
+        </w:rPr>
+        <w:t>_</w:t>
+      </w:r>
+      <w:r>
+        <w:rPr>
+          <w:lang w:val="en-US"/>
+        </w:rPr>
+        <w:t>APPENDIX</w:t>
+      </w:r>
+      <w:bookmarkStart w:id="139" w:name="_Toc209703516"/>
+      <w:bookmarkStart w:id="140" w:name="_Toc221000989"/>
+    </w:p>
+    <w:p>
+      <w:pPr>
+        <w:pStyle w:val="1"/>
+        <w:jc w:val="left"/>
+        <w:rPr>
+          <w:lang w:val="en-US"/>
+        </w:rPr>
+      </w:pPr>
+      <w:r>
+        <w:t>ПРИЛОЖЕНИЕ</w:t>
+      </w:r>
+      <w:r>
+        <w:rPr>
+          <w:lang w:val="en-US"/>
+        </w:rPr>
+        <w:t xml:space="preserve"> 2. </w:t>
+      </w:r>
+      <w:r>
+        <w:t>Паспорт</w:t>
+      </w:r>
+      <w:r>
+        <w:rPr>
+          <w:lang w:val="en-US"/>
+        </w:rPr>
+        <w:t xml:space="preserve"> </w:t>
+      </w:r>
+      <w:bookmarkEnd w:id="135"/>
       <w:bookmarkEnd w:id="136"/>
       <w:bookmarkEnd w:id="137"/>
-    </w:p>
-    <w:p>
-      <w:pPr>
-        <w:jc w:val="center"/>
-      </w:pPr>
-      <w:r>
-        <w:t>ASF</w:t>
-      </w:r>
-      <w:r>
-        <w:t>_IMAGE_</w:t>
-      </w:r>
-      <w:r>
-        <w:t>1</w:t>
-      </w:r>
-      <w:r>
-        <w:t>_</w:t>
-      </w:r>
-      <w:r>
-        <w:t>APPENDIX</w:t>
-      </w:r>
-      <w:bookmarkStart w:id="138" w:name="_Toc209703516"/>
-      <w:bookmarkStart w:id="139" w:name="_Toc221000989"/>
-    </w:p>
-    <w:p>
-      <w:pPr>
-        <w:pStyle w:val="1"/>
-        <w:jc w:val="left"/>
-      </w:pPr>
-      <w:r>
-        <w:t xml:space="preserve">ПРИЛОЖЕНИЕ 2. Паспорт </w:t>
-      </w:r>
-      <w:bookmarkEnd w:id="131"/>
-      <w:bookmarkEnd w:id="132"/>
-      <w:bookmarkEnd w:id="133"/>
-      <w:bookmarkEnd w:id="134"/>
       <w:bookmarkEnd w:id="138"/>
       <w:bookmarkEnd w:id="139"/>
+      <w:bookmarkEnd w:id="140"/>
       <w:sdt>
         <w:sdtPr>
+          <w:rPr>
+            <w:lang w:val="en-US"/>
+          </w:rPr>
           <w:tag w:val="ASF_STATUS_SHORT"/>
           <w:id w:val="1402640020"/>
           <w:placeholder>
@@ -20192,18 +19950,26 @@
           </w:placeholder>
           <w:text/>
         </w:sdtPr>
-        <w:sdtEndPr/>
         <w:sdtContent>
           <w:r>
+            <w:rPr>
+              <w:lang w:val="en-US"/>
+            </w:rPr>
             <w:t>${ASF_STATUS_SHORT}</w:t>
           </w:r>
         </w:sdtContent>
       </w:sdt>
       <w:r>
+        <w:rPr>
+          <w:lang w:val="en-US"/>
+        </w:rPr>
         <w:t xml:space="preserve"> </w:t>
       </w:r>
       <w:sdt>
         <w:sdtPr>
+          <w:rPr>
+            <w:lang w:val="en-US"/>
+          </w:rPr>
           <w:tag w:val="ASF_SHORT_NAME"/>
           <w:id w:val="260968358"/>
           <w:placeholder>
@@ -20211,9 +19977,11 @@
           </w:placeholder>
           <w:text/>
         </w:sdtPr>
-        <w:sdtEndPr/>
         <w:sdtContent>
           <w:r>
+            <w:rPr>
+              <w:lang w:val="en-US"/>
+            </w:rPr>
             <w:t>${ASF_SHORT_NAME}</w:t>
           </w:r>
         </w:sdtContent>
@@ -20224,12 +19992,7 @@
         <w:jc w:val="center"/>
       </w:pPr>
       <w:r>
-        <w:t>ASF_IM</w:t>
-      </w:r>
-      <w:bookmarkStart w:id="140" w:name="_GoBack"/>
-      <w:bookmarkEnd w:id="140"/>
-      <w:r>
-        <w:t>AGE_2_APPENDIX</w:t>
+        <w:t>ASF_IMAGE_2_APPENDIX</w:t>
       </w:r>
     </w:p>
     <w:sectPr>
@@ -20377,7 +20140,6 @@
       </w:placeholder>
       <w:text/>
     </w:sdtPr>
-    <w:sdtEndPr/>
     <w:sdtContent>
       <w:p>
         <w:pPr>
@@ -28610,7 +28372,7 @@
     <w:charset w:val="00"/>
     <w:family w:val="roman"/>
     <w:pitch w:val="variable"/>
-    <w:sig w:usb0="E0002EFF" w:usb1="C000785B" w:usb2="00000009" w:usb3="00000000" w:csb0="000001FF" w:csb1="00000000"/>
+    <w:sig w:usb0="E0002AFF" w:usb1="C0007843" w:usb2="00000009" w:usb3="00000000" w:csb0="000001FF" w:csb1="00000000"/>
   </w:font>
   <w:font w:name="Symbol">
     <w:panose1 w:val="05050102010706020507"/>
@@ -28635,10 +28397,10 @@
   </w:font>
   <w:font w:name="Calibri">
     <w:panose1 w:val="020F0502020204030204"/>
-    <w:charset w:val="CC"/>
+    <w:charset w:val="00"/>
     <w:family w:val="swiss"/>
     <w:pitch w:val="variable"/>
-    <w:sig w:usb0="E4002EFF" w:usb1="C200247B" w:usb2="00000009" w:usb3="00000000" w:csb0="000001FF" w:csb1="00000000"/>
+    <w:sig w:usb0="E0002AFF" w:usb1="4000ACFF" w:usb2="00000001" w:usb3="00000000" w:csb0="000001FF" w:csb1="00000000"/>
   </w:font>
   <w:font w:name="Cambria">
     <w:panose1 w:val="02040503050406030204"/>
@@ -28659,14 +28421,14 @@
     <w:charset w:val="00"/>
     <w:family w:val="swiss"/>
     <w:pitch w:val="variable"/>
-    <w:sig w:usb0="E0002EFF" w:usb1="C000785B" w:usb2="00000009" w:usb3="00000000" w:csb0="000001FF" w:csb1="00000000"/>
+    <w:sig w:usb0="E0002AFF" w:usb1="C0007843" w:usb2="00000009" w:usb3="00000000" w:csb0="000001FF" w:csb1="00000000"/>
   </w:font>
   <w:font w:name="Calibri Light">
     <w:panose1 w:val="020F0302020204030204"/>
-    <w:charset w:val="CC"/>
+    <w:charset w:val="00"/>
     <w:family w:val="swiss"/>
     <w:pitch w:val="variable"/>
-    <w:sig w:usb0="E4002EFF" w:usb1="C200247B" w:usb2="00000009" w:usb3="00000000" w:csb0="000001FF" w:csb1="00000000"/>
+    <w:sig w:usb0="A0002AEF" w:usb1="4000207B" w:usb2="00000000" w:usb3="00000000" w:csb0="000001FF" w:csb1="00000000"/>
   </w:font>
   <w:font w:name="MS Gothic">
     <w:altName w:val="ＭＳ ゴシック"/>
@@ -28727,10 +28489,14 @@
     <w:rsid w:val="00334991"/>
     <w:rsid w:val="00341460"/>
     <w:rsid w:val="003473D0"/>
+    <w:rsid w:val="0036093E"/>
     <w:rsid w:val="00383679"/>
+    <w:rsid w:val="003B40F6"/>
     <w:rsid w:val="003D7834"/>
     <w:rsid w:val="004322BD"/>
     <w:rsid w:val="00451345"/>
+    <w:rsid w:val="00457425"/>
+    <w:rsid w:val="00464A53"/>
     <w:rsid w:val="00482A4F"/>
     <w:rsid w:val="00496262"/>
     <w:rsid w:val="00496CD3"/>
@@ -28740,6 +28506,7 @@
     <w:rsid w:val="00594162"/>
     <w:rsid w:val="00595627"/>
     <w:rsid w:val="005A552B"/>
+    <w:rsid w:val="005B6EB4"/>
     <w:rsid w:val="005E12F1"/>
     <w:rsid w:val="005E201E"/>
     <w:rsid w:val="006034BD"/>
@@ -28768,10 +28535,12 @@
     <w:rsid w:val="00A31763"/>
     <w:rsid w:val="00A37A20"/>
     <w:rsid w:val="00A6198B"/>
+    <w:rsid w:val="00B5435B"/>
     <w:rsid w:val="00B63816"/>
     <w:rsid w:val="00B66477"/>
     <w:rsid w:val="00C10959"/>
     <w:rsid w:val="00C14CD6"/>
+    <w:rsid w:val="00C64ACF"/>
     <w:rsid w:val="00CD19C9"/>
     <w:rsid w:val="00CF1004"/>
     <w:rsid w:val="00D122CB"/>
@@ -28787,6 +28556,9 @@
     <w:rsid w:val="00EE1FBF"/>
     <w:rsid w:val="00EF1414"/>
     <w:rsid w:val="00F25C9D"/>
+    <w:rsid w:val="00F47885"/>
+    <w:rsid w:val="00F663FA"/>
+    <w:rsid w:val="00FB25FF"/>
     <w:rsid w:val="00FF50B0"/>
   </w:rsids>
   <m:mathPr>
@@ -29241,7 +29013,7 @@
     <w:basedOn w:val="a0"/>
     <w:uiPriority w:val="99"/>
     <w:semiHidden/>
-    <w:rsid w:val="00EE1FBF"/>
+    <w:rsid w:val="0036093E"/>
     <w:rPr>
       <w:color w:val="808080"/>
     </w:rPr>
@@ -29517,6 +29289,10 @@
   <w:style w:type="paragraph" w:customStyle="1" w:styleId="4CD1E67F7C854A8E8E94F60A06DFEB00">
     <w:name w:val="4CD1E67F7C854A8E8E94F60A06DFEB00"/>
     <w:rsid w:val="00EE1FBF"/>
+  </w:style>
+  <w:style w:type="paragraph" w:customStyle="1" w:styleId="DEE27F533D294CAABC64E171D6308531">
+    <w:name w:val="DEE27F533D294CAABC64E171D6308531"/>
+    <w:rsid w:val="0036093E"/>
   </w:style>
 </w:styles>
 </file>
@@ -29828,7 +29604,7 @@
 </file>
 
 <file path=customXml/itemProps1.xml><?xml version="1.0" encoding="utf-8"?>
-<ds:datastoreItem xmlns:ds="http://schemas.openxmlformats.org/officeDocument/2006/customXml" ds:itemID="{0C4B783D-EC8F-4723-996E-F6A06D57E4FA}">
+<ds:datastoreItem xmlns:ds="http://schemas.openxmlformats.org/officeDocument/2006/customXml" ds:itemID="{5DE24610-26D5-4542-B994-E5C83782693C}">
   <ds:schemaRefs>
     <ds:schemaRef ds:uri="http://schemas.openxmlformats.org/officeDocument/2006/bibliography"/>
   </ds:schemaRefs>

</xml_diff>